<commit_message>
Update the help document and its PDF.
</commit_message>
<xml_diff>
--- a/AlpacaDriverDemo/CustomisationHelp/CSharpAlpacaTemplate.docx
+++ b/AlpacaDriverDemo/CustomisationHelp/CSharpAlpacaTemplate.docx
@@ -1255,7 +1255,7 @@
           <w:r>
             <w:fldChar w:fldCharType="separate"/>
           </w:r>
-          <w:hyperlink w:anchor="_Toc238635404" w:history="1">
+          <w:hyperlink w:anchor="_Toc239753725" w:history="1">
             <w:r>
               <w:rPr>
                 <w:rStyle w:val="Hyperlink"/>
@@ -1282,7 +1282,7 @@
                 <w:noProof/>
                 <w:webHidden/>
               </w:rPr>
-              <w:instrText xml:space="preserve"> PAGEREF _Toc238635404 \h </w:instrText>
+              <w:instrText xml:space="preserve"> PAGEREF _Toc239753725 \h </w:instrText>
             </w:r>
             <w:r>
               <w:rPr>
@@ -1329,7 +1329,7 @@
               <w14:ligatures w14:val="standardContextual"/>
             </w:rPr>
           </w:pPr>
-          <w:hyperlink w:anchor="_Toc238635405" w:history="1">
+          <w:hyperlink w:anchor="_Toc239753726" w:history="1">
             <w:r>
               <w:rPr>
                 <w:rStyle w:val="Hyperlink"/>
@@ -1356,7 +1356,7 @@
                 <w:noProof/>
                 <w:webHidden/>
               </w:rPr>
-              <w:instrText xml:space="preserve"> PAGEREF _Toc238635405 \h </w:instrText>
+              <w:instrText xml:space="preserve"> PAGEREF _Toc239753726 \h </w:instrText>
             </w:r>
             <w:r>
               <w:rPr>
@@ -1403,7 +1403,7 @@
               <w14:ligatures w14:val="standardContextual"/>
             </w:rPr>
           </w:pPr>
-          <w:hyperlink w:anchor="_Toc238635406" w:history="1">
+          <w:hyperlink w:anchor="_Toc239753727" w:history="1">
             <w:r>
               <w:rPr>
                 <w:rStyle w:val="Hyperlink"/>
@@ -1430,7 +1430,7 @@
                 <w:noProof/>
                 <w:webHidden/>
               </w:rPr>
-              <w:instrText xml:space="preserve"> PAGEREF _Toc238635406 \h </w:instrText>
+              <w:instrText xml:space="preserve"> PAGEREF _Toc239753727 \h </w:instrText>
             </w:r>
             <w:r>
               <w:rPr>
@@ -1477,7 +1477,7 @@
               <w14:ligatures w14:val="standardContextual"/>
             </w:rPr>
           </w:pPr>
-          <w:hyperlink w:anchor="_Toc238635407" w:history="1">
+          <w:hyperlink w:anchor="_Toc239753728" w:history="1">
             <w:r>
               <w:rPr>
                 <w:rStyle w:val="Hyperlink"/>
@@ -1504,7 +1504,7 @@
                 <w:noProof/>
                 <w:webHidden/>
               </w:rPr>
-              <w:instrText xml:space="preserve"> PAGEREF _Toc238635407 \h </w:instrText>
+              <w:instrText xml:space="preserve"> PAGEREF _Toc239753728 \h </w:instrText>
             </w:r>
             <w:r>
               <w:rPr>
@@ -1551,7 +1551,7 @@
               <w14:ligatures w14:val="standardContextual"/>
             </w:rPr>
           </w:pPr>
-          <w:hyperlink w:anchor="_Toc238635408" w:history="1">
+          <w:hyperlink w:anchor="_Toc239753729" w:history="1">
             <w:r>
               <w:rPr>
                 <w:rStyle w:val="Hyperlink"/>
@@ -1578,7 +1578,7 @@
                 <w:noProof/>
                 <w:webHidden/>
               </w:rPr>
-              <w:instrText xml:space="preserve"> PAGEREF _Toc238635408 \h </w:instrText>
+              <w:instrText xml:space="preserve"> PAGEREF _Toc239753729 \h </w:instrText>
             </w:r>
             <w:r>
               <w:rPr>
@@ -1625,7 +1625,7 @@
               <w14:ligatures w14:val="standardContextual"/>
             </w:rPr>
           </w:pPr>
-          <w:hyperlink w:anchor="_Toc238635409" w:history="1">
+          <w:hyperlink w:anchor="_Toc239753730" w:history="1">
             <w:r>
               <w:rPr>
                 <w:rStyle w:val="Hyperlink"/>
@@ -1652,7 +1652,7 @@
                 <w:noProof/>
                 <w:webHidden/>
               </w:rPr>
-              <w:instrText xml:space="preserve"> PAGEREF _Toc238635409 \h </w:instrText>
+              <w:instrText xml:space="preserve"> PAGEREF _Toc239753730 \h </w:instrText>
             </w:r>
             <w:r>
               <w:rPr>
@@ -1699,7 +1699,7 @@
               <w14:ligatures w14:val="standardContextual"/>
             </w:rPr>
           </w:pPr>
-          <w:hyperlink w:anchor="_Toc238635410" w:history="1">
+          <w:hyperlink w:anchor="_Toc239753731" w:history="1">
             <w:r>
               <w:rPr>
                 <w:rStyle w:val="Hyperlink"/>
@@ -1726,7 +1726,7 @@
                 <w:noProof/>
                 <w:webHidden/>
               </w:rPr>
-              <w:instrText xml:space="preserve"> PAGEREF _Toc238635410 \h </w:instrText>
+              <w:instrText xml:space="preserve"> PAGEREF _Toc239753731 \h </w:instrText>
             </w:r>
             <w:r>
               <w:rPr>
@@ -1746,7 +1746,7 @@
                 <w:noProof/>
                 <w:webHidden/>
               </w:rPr>
-              <w:t>3</w:t>
+              <w:t>4</w:t>
             </w:r>
             <w:r>
               <w:rPr>
@@ -1773,7 +1773,7 @@
               <w14:ligatures w14:val="standardContextual"/>
             </w:rPr>
           </w:pPr>
-          <w:hyperlink w:anchor="_Toc238635411" w:history="1">
+          <w:hyperlink w:anchor="_Toc239753732" w:history="1">
             <w:r>
               <w:rPr>
                 <w:rStyle w:val="Hyperlink"/>
@@ -1800,7 +1800,7 @@
                 <w:noProof/>
                 <w:webHidden/>
               </w:rPr>
-              <w:instrText xml:space="preserve"> PAGEREF _Toc238635411 \h </w:instrText>
+              <w:instrText xml:space="preserve"> PAGEREF _Toc239753732 \h </w:instrText>
             </w:r>
             <w:r>
               <w:rPr>
@@ -1847,7 +1847,7 @@
               <w14:ligatures w14:val="standardContextual"/>
             </w:rPr>
           </w:pPr>
-          <w:hyperlink w:anchor="_Toc238635412" w:history="1">
+          <w:hyperlink w:anchor="_Toc239753733" w:history="1">
             <w:r>
               <w:rPr>
                 <w:rStyle w:val="Hyperlink"/>
@@ -1874,7 +1874,7 @@
                 <w:noProof/>
                 <w:webHidden/>
               </w:rPr>
-              <w:instrText xml:space="preserve"> PAGEREF _Toc238635412 \h </w:instrText>
+              <w:instrText xml:space="preserve"> PAGEREF _Toc239753733 \h </w:instrText>
             </w:r>
             <w:r>
               <w:rPr>
@@ -1921,7 +1921,7 @@
               <w14:ligatures w14:val="standardContextual"/>
             </w:rPr>
           </w:pPr>
-          <w:hyperlink w:anchor="_Toc238635413" w:history="1">
+          <w:hyperlink w:anchor="_Toc239753734" w:history="1">
             <w:r>
               <w:rPr>
                 <w:rStyle w:val="Hyperlink"/>
@@ -1948,7 +1948,7 @@
                 <w:noProof/>
                 <w:webHidden/>
               </w:rPr>
-              <w:instrText xml:space="preserve"> PAGEREF _Toc238635413 \h </w:instrText>
+              <w:instrText xml:space="preserve"> PAGEREF _Toc239753734 \h </w:instrText>
             </w:r>
             <w:r>
               <w:rPr>
@@ -1995,13 +1995,13 @@
               <w14:ligatures w14:val="standardContextual"/>
             </w:rPr>
           </w:pPr>
-          <w:hyperlink w:anchor="_Toc238635414" w:history="1">
+          <w:hyperlink w:anchor="_Toc239753735" w:history="1">
             <w:r>
               <w:rPr>
                 <w:rStyle w:val="Hyperlink"/>
                 <w:noProof/>
               </w:rPr>
-              <w:t>Implementing the hardware interface</w:t>
+              <w:t>Implementing the connection management members</w:t>
             </w:r>
             <w:r>
               <w:rPr>
@@ -2022,7 +2022,7 @@
                 <w:noProof/>
                 <w:webHidden/>
               </w:rPr>
-              <w:instrText xml:space="preserve"> PAGEREF _Toc238635414 \h </w:instrText>
+              <w:instrText xml:space="preserve"> PAGEREF _Toc239753735 \h </w:instrText>
             </w:r>
             <w:r>
               <w:rPr>
@@ -2069,13 +2069,13 @@
               <w14:ligatures w14:val="standardContextual"/>
             </w:rPr>
           </w:pPr>
-          <w:hyperlink w:anchor="_Toc238635415" w:history="1">
+          <w:hyperlink w:anchor="_Toc239753736" w:history="1">
             <w:r>
               <w:rPr>
                 <w:rStyle w:val="Hyperlink"/>
                 <w:noProof/>
               </w:rPr>
-              <w:t>How to view Alpaca protocol messages</w:t>
+              <w:t>Implementing the hardware interface</w:t>
             </w:r>
             <w:r>
               <w:rPr>
@@ -2096,7 +2096,7 @@
                 <w:noProof/>
                 <w:webHidden/>
               </w:rPr>
-              <w:instrText xml:space="preserve"> PAGEREF _Toc238635415 \h </w:instrText>
+              <w:instrText xml:space="preserve"> PAGEREF _Toc239753736 \h </w:instrText>
             </w:r>
             <w:r>
               <w:rPr>
@@ -2143,13 +2143,13 @@
               <w14:ligatures w14:val="standardContextual"/>
             </w:rPr>
           </w:pPr>
-          <w:hyperlink w:anchor="_Toc238635416" w:history="1">
+          <w:hyperlink w:anchor="_Toc239753737" w:history="1">
             <w:r>
               <w:rPr>
                 <w:rStyle w:val="Hyperlink"/>
                 <w:noProof/>
               </w:rPr>
-              <w:t>How to use a serial port to communicate with hardware</w:t>
+              <w:t>How to view Alpaca protocol messages</w:t>
             </w:r>
             <w:r>
               <w:rPr>
@@ -2170,7 +2170,7 @@
                 <w:noProof/>
                 <w:webHidden/>
               </w:rPr>
-              <w:instrText xml:space="preserve"> PAGEREF _Toc238635416 \h </w:instrText>
+              <w:instrText xml:space="preserve"> PAGEREF _Toc239753737 \h </w:instrText>
             </w:r>
             <w:r>
               <w:rPr>
@@ -2190,7 +2190,7 @@
                 <w:noProof/>
                 <w:webHidden/>
               </w:rPr>
-              <w:t>6</w:t>
+              <w:t>7</w:t>
             </w:r>
             <w:r>
               <w:rPr>
@@ -2217,13 +2217,13 @@
               <w14:ligatures w14:val="standardContextual"/>
             </w:rPr>
           </w:pPr>
-          <w:hyperlink w:anchor="_Toc238635417" w:history="1">
+          <w:hyperlink w:anchor="_Toc239753738" w:history="1">
             <w:r>
               <w:rPr>
                 <w:rStyle w:val="Hyperlink"/>
                 <w:noProof/>
               </w:rPr>
-              <w:t>How to use TCP/IP to communicate with hardware</w:t>
+              <w:t>How to use a serial port to communicate with hardware</w:t>
             </w:r>
             <w:r>
               <w:rPr>
@@ -2244,7 +2244,7 @@
                 <w:noProof/>
                 <w:webHidden/>
               </w:rPr>
-              <w:instrText xml:space="preserve"> PAGEREF _Toc238635417 \h </w:instrText>
+              <w:instrText xml:space="preserve"> PAGEREF _Toc239753738 \h </w:instrText>
             </w:r>
             <w:r>
               <w:rPr>
@@ -2264,7 +2264,7 @@
                 <w:noProof/>
                 <w:webHidden/>
               </w:rPr>
-              <w:t>8</w:t>
+              <w:t>7</w:t>
             </w:r>
             <w:r>
               <w:rPr>
@@ -2291,13 +2291,13 @@
               <w14:ligatures w14:val="standardContextual"/>
             </w:rPr>
           </w:pPr>
-          <w:hyperlink w:anchor="_Toc238635418" w:history="1">
+          <w:hyperlink w:anchor="_Toc239753739" w:history="1">
             <w:r>
               <w:rPr>
                 <w:rStyle w:val="Hyperlink"/>
                 <w:noProof/>
               </w:rPr>
-              <w:t>How to add a new persisted configuration setting</w:t>
+              <w:t>How to use TCP/IP to communicate with hardware</w:t>
             </w:r>
             <w:r>
               <w:rPr>
@@ -2318,7 +2318,7 @@
                 <w:noProof/>
                 <w:webHidden/>
               </w:rPr>
-              <w:instrText xml:space="preserve"> PAGEREF _Toc238635418 \h </w:instrText>
+              <w:instrText xml:space="preserve"> PAGEREF _Toc239753739 \h </w:instrText>
             </w:r>
             <w:r>
               <w:rPr>
@@ -2365,13 +2365,13 @@
               <w14:ligatures w14:val="standardContextual"/>
             </w:rPr>
           </w:pPr>
-          <w:hyperlink w:anchor="_Toc238635419" w:history="1">
+          <w:hyperlink w:anchor="_Toc239753740" w:history="1">
             <w:r>
               <w:rPr>
                 <w:rStyle w:val="Hyperlink"/>
                 <w:noProof/>
               </w:rPr>
-              <w:t>How to add a configurable setting to the web setup UI.</w:t>
+              <w:t>How to add a new persisted configuration setting</w:t>
             </w:r>
             <w:r>
               <w:rPr>
@@ -2392,7 +2392,7 @@
                 <w:noProof/>
                 <w:webHidden/>
               </w:rPr>
-              <w:instrText xml:space="preserve"> PAGEREF _Toc238635419 \h </w:instrText>
+              <w:instrText xml:space="preserve"> PAGEREF _Toc239753740 \h </w:instrText>
             </w:r>
             <w:r>
               <w:rPr>
@@ -2439,13 +2439,13 @@
               <w14:ligatures w14:val="standardContextual"/>
             </w:rPr>
           </w:pPr>
-          <w:hyperlink w:anchor="_Toc238635420" w:history="1">
+          <w:hyperlink w:anchor="_Toc239753741" w:history="1">
             <w:r>
               <w:rPr>
                 <w:rStyle w:val="Hyperlink"/>
                 <w:noProof/>
               </w:rPr>
-              <w:t>How to configure security</w:t>
+              <w:t>How to add a configurable setting to the web setup UI.</w:t>
             </w:r>
             <w:r>
               <w:rPr>
@@ -2466,7 +2466,7 @@
                 <w:noProof/>
                 <w:webHidden/>
               </w:rPr>
-              <w:instrText xml:space="preserve"> PAGEREF _Toc238635420 \h </w:instrText>
+              <w:instrText xml:space="preserve"> PAGEREF _Toc239753741 \h </w:instrText>
             </w:r>
             <w:r>
               <w:rPr>
@@ -2513,13 +2513,13 @@
               <w14:ligatures w14:val="standardContextual"/>
             </w:rPr>
           </w:pPr>
-          <w:hyperlink w:anchor="_Toc238635421" w:history="1">
+          <w:hyperlink w:anchor="_Toc239753742" w:history="1">
             <w:r>
               <w:rPr>
                 <w:rStyle w:val="Hyperlink"/>
                 <w:noProof/>
               </w:rPr>
-              <w:t>Appendix 1 - Project structure</w:t>
+              <w:t>How to configure security</w:t>
             </w:r>
             <w:r>
               <w:rPr>
@@ -2540,7 +2540,7 @@
                 <w:noProof/>
                 <w:webHidden/>
               </w:rPr>
-              <w:instrText xml:space="preserve"> PAGEREF _Toc238635421 \h </w:instrText>
+              <w:instrText xml:space="preserve"> PAGEREF _Toc239753742 \h </w:instrText>
             </w:r>
             <w:r>
               <w:rPr>
@@ -2587,13 +2587,13 @@
               <w14:ligatures w14:val="standardContextual"/>
             </w:rPr>
           </w:pPr>
-          <w:hyperlink w:anchor="_Toc238635422" w:history="1">
+          <w:hyperlink w:anchor="_Toc239753743" w:history="1">
             <w:r>
               <w:rPr>
                 <w:rStyle w:val="Hyperlink"/>
                 <w:noProof/>
               </w:rPr>
-              <w:t>Appendix 2 – Example Razor setup page</w:t>
+              <w:t>How to alter the application shutdown timeout</w:t>
             </w:r>
             <w:r>
               <w:rPr>
@@ -2614,7 +2614,7 @@
                 <w:noProof/>
                 <w:webHidden/>
               </w:rPr>
-              <w:instrText xml:space="preserve"> PAGEREF _Toc238635422 \h </w:instrText>
+              <w:instrText xml:space="preserve"> PAGEREF _Toc239753743 \h </w:instrText>
             </w:r>
             <w:r>
               <w:rPr>
@@ -2634,7 +2634,7 @@
                 <w:noProof/>
                 <w:webHidden/>
               </w:rPr>
-              <w:t>12</w:t>
+              <w:t>10</w:t>
             </w:r>
             <w:r>
               <w:rPr>
@@ -2661,11 +2661,233 @@
               <w14:ligatures w14:val="standardContextual"/>
             </w:rPr>
           </w:pPr>
-          <w:hyperlink w:anchor="_Toc238635423" w:history="1">
+          <w:hyperlink w:anchor="_Toc239753744" w:history="1">
             <w:r>
               <w:rPr>
                 <w:rStyle w:val="Hyperlink"/>
                 <w:noProof/>
+              </w:rPr>
+              <w:t>Configuring device defaults</w:t>
+            </w:r>
+            <w:r>
+              <w:rPr>
+                <w:noProof/>
+                <w:webHidden/>
+              </w:rPr>
+              <w:tab/>
+            </w:r>
+            <w:r>
+              <w:rPr>
+                <w:noProof/>
+                <w:webHidden/>
+              </w:rPr>
+              <w:fldChar w:fldCharType="begin"/>
+            </w:r>
+            <w:r>
+              <w:rPr>
+                <w:noProof/>
+                <w:webHidden/>
+              </w:rPr>
+              <w:instrText xml:space="preserve"> PAGEREF _Toc239753744 \h </w:instrText>
+            </w:r>
+            <w:r>
+              <w:rPr>
+                <w:noProof/>
+                <w:webHidden/>
+              </w:rPr>
+            </w:r>
+            <w:r>
+              <w:rPr>
+                <w:noProof/>
+                <w:webHidden/>
+              </w:rPr>
+              <w:fldChar w:fldCharType="separate"/>
+            </w:r>
+            <w:r>
+              <w:rPr>
+                <w:noProof/>
+                <w:webHidden/>
+              </w:rPr>
+              <w:t>11</w:t>
+            </w:r>
+            <w:r>
+              <w:rPr>
+                <w:noProof/>
+                <w:webHidden/>
+              </w:rPr>
+              <w:fldChar w:fldCharType="end"/>
+            </w:r>
+          </w:hyperlink>
+        </w:p>
+        <w:p>
+          <w:pPr>
+            <w:pStyle w:val="TOC1"/>
+            <w:tabs>
+              <w:tab w:val="right" w:leader="dot" w:pos="9628"/>
+            </w:tabs>
+            <w:rPr>
+              <w:rFonts w:eastAsiaTheme="minorEastAsia"/>
+              <w:noProof/>
+              <w:kern w:val="2"/>
+              <w:sz w:val="24"/>
+              <w:szCs w:val="24"/>
+              <w:lang w:eastAsia="en-GB"/>
+              <w14:ligatures w14:val="standardContextual"/>
+            </w:rPr>
+          </w:pPr>
+          <w:hyperlink w:anchor="_Toc239753745" w:history="1">
+            <w:r>
+              <w:rPr>
+                <w:rStyle w:val="Hyperlink"/>
+                <w:noProof/>
+              </w:rPr>
+              <w:t>Appendix 1 - Project structure</w:t>
+            </w:r>
+            <w:r>
+              <w:rPr>
+                <w:noProof/>
+                <w:webHidden/>
+              </w:rPr>
+              <w:tab/>
+            </w:r>
+            <w:r>
+              <w:rPr>
+                <w:noProof/>
+                <w:webHidden/>
+              </w:rPr>
+              <w:fldChar w:fldCharType="begin"/>
+            </w:r>
+            <w:r>
+              <w:rPr>
+                <w:noProof/>
+                <w:webHidden/>
+              </w:rPr>
+              <w:instrText xml:space="preserve"> PAGEREF _Toc239753745 \h </w:instrText>
+            </w:r>
+            <w:r>
+              <w:rPr>
+                <w:noProof/>
+                <w:webHidden/>
+              </w:rPr>
+            </w:r>
+            <w:r>
+              <w:rPr>
+                <w:noProof/>
+                <w:webHidden/>
+              </w:rPr>
+              <w:fldChar w:fldCharType="separate"/>
+            </w:r>
+            <w:r>
+              <w:rPr>
+                <w:noProof/>
+                <w:webHidden/>
+              </w:rPr>
+              <w:t>12</w:t>
+            </w:r>
+            <w:r>
+              <w:rPr>
+                <w:noProof/>
+                <w:webHidden/>
+              </w:rPr>
+              <w:fldChar w:fldCharType="end"/>
+            </w:r>
+          </w:hyperlink>
+        </w:p>
+        <w:p>
+          <w:pPr>
+            <w:pStyle w:val="TOC1"/>
+            <w:tabs>
+              <w:tab w:val="right" w:leader="dot" w:pos="9628"/>
+            </w:tabs>
+            <w:rPr>
+              <w:rFonts w:eastAsiaTheme="minorEastAsia"/>
+              <w:noProof/>
+              <w:kern w:val="2"/>
+              <w:sz w:val="24"/>
+              <w:szCs w:val="24"/>
+              <w:lang w:eastAsia="en-GB"/>
+              <w14:ligatures w14:val="standardContextual"/>
+            </w:rPr>
+          </w:pPr>
+          <w:hyperlink w:anchor="_Toc239753746" w:history="1">
+            <w:r>
+              <w:rPr>
+                <w:rStyle w:val="Hyperlink"/>
+                <w:noProof/>
+              </w:rPr>
+              <w:t>Appendix 2 – Example Razor setup page</w:t>
+            </w:r>
+            <w:r>
+              <w:rPr>
+                <w:noProof/>
+                <w:webHidden/>
+              </w:rPr>
+              <w:tab/>
+            </w:r>
+            <w:r>
+              <w:rPr>
+                <w:noProof/>
+                <w:webHidden/>
+              </w:rPr>
+              <w:fldChar w:fldCharType="begin"/>
+            </w:r>
+            <w:r>
+              <w:rPr>
+                <w:noProof/>
+                <w:webHidden/>
+              </w:rPr>
+              <w:instrText xml:space="preserve"> PAGEREF _Toc239753746 \h </w:instrText>
+            </w:r>
+            <w:r>
+              <w:rPr>
+                <w:noProof/>
+                <w:webHidden/>
+              </w:rPr>
+            </w:r>
+            <w:r>
+              <w:rPr>
+                <w:noProof/>
+                <w:webHidden/>
+              </w:rPr>
+              <w:fldChar w:fldCharType="separate"/>
+            </w:r>
+            <w:r>
+              <w:rPr>
+                <w:noProof/>
+                <w:webHidden/>
+              </w:rPr>
+              <w:t>14</w:t>
+            </w:r>
+            <w:r>
+              <w:rPr>
+                <w:noProof/>
+                <w:webHidden/>
+              </w:rPr>
+              <w:fldChar w:fldCharType="end"/>
+            </w:r>
+          </w:hyperlink>
+        </w:p>
+        <w:p>
+          <w:pPr>
+            <w:pStyle w:val="TOC1"/>
+            <w:tabs>
+              <w:tab w:val="right" w:leader="dot" w:pos="9628"/>
+            </w:tabs>
+            <w:rPr>
+              <w:rFonts w:eastAsiaTheme="minorEastAsia"/>
+              <w:noProof/>
+              <w:kern w:val="2"/>
+              <w:sz w:val="24"/>
+              <w:szCs w:val="24"/>
+              <w:lang w:eastAsia="en-GB"/>
+              <w14:ligatures w14:val="standardContextual"/>
+            </w:rPr>
+          </w:pPr>
+          <w:hyperlink w:anchor="_Toc239753747" w:history="1">
+            <w:r>
+              <w:rPr>
+                <w:rStyle w:val="Hyperlink"/>
+                <w:noProof/>
                 <w:highlight w:val="white"/>
               </w:rPr>
               <w:t>Appendix 3 – Installing and using WireShark</w:t>
@@ -2689,7 +2911,7 @@
                 <w:noProof/>
                 <w:webHidden/>
               </w:rPr>
-              <w:instrText xml:space="preserve"> PAGEREF _Toc238635423 \h </w:instrText>
+              <w:instrText xml:space="preserve"> PAGEREF _Toc239753747 \h </w:instrText>
             </w:r>
             <w:r>
               <w:rPr>
@@ -2709,7 +2931,7 @@
                 <w:noProof/>
                 <w:webHidden/>
               </w:rPr>
-              <w:t>14</w:t>
+              <w:t>16</w:t>
             </w:r>
             <w:r>
               <w:rPr>
@@ -2736,7 +2958,7 @@
               <w14:ligatures w14:val="standardContextual"/>
             </w:rPr>
           </w:pPr>
-          <w:hyperlink w:anchor="_Toc238635424" w:history="1">
+          <w:hyperlink w:anchor="_Toc239753748" w:history="1">
             <w:r>
               <w:rPr>
                 <w:rStyle w:val="Hyperlink"/>
@@ -2763,7 +2985,7 @@
                 <w:noProof/>
                 <w:webHidden/>
               </w:rPr>
-              <w:instrText xml:space="preserve"> PAGEREF _Toc238635424 \h </w:instrText>
+              <w:instrText xml:space="preserve"> PAGEREF _Toc239753748 \h </w:instrText>
             </w:r>
             <w:r>
               <w:rPr>
@@ -2783,7 +3005,7 @@
                 <w:noProof/>
                 <w:webHidden/>
               </w:rPr>
-              <w:t>14</w:t>
+              <w:t>16</w:t>
             </w:r>
             <w:r>
               <w:rPr>
@@ -2810,7 +3032,7 @@
               <w14:ligatures w14:val="standardContextual"/>
             </w:rPr>
           </w:pPr>
-          <w:hyperlink w:anchor="_Toc238635425" w:history="1">
+          <w:hyperlink w:anchor="_Toc239753749" w:history="1">
             <w:r>
               <w:rPr>
                 <w:rStyle w:val="Hyperlink"/>
@@ -2837,7 +3059,7 @@
                 <w:noProof/>
                 <w:webHidden/>
               </w:rPr>
-              <w:instrText xml:space="preserve"> PAGEREF _Toc238635425 \h </w:instrText>
+              <w:instrText xml:space="preserve"> PAGEREF _Toc239753749 \h </w:instrText>
             </w:r>
             <w:r>
               <w:rPr>
@@ -2857,7 +3079,7 @@
                 <w:noProof/>
                 <w:webHidden/>
               </w:rPr>
-              <w:t>14</w:t>
+              <w:t>16</w:t>
             </w:r>
             <w:r>
               <w:rPr>
@@ -2884,7 +3106,7 @@
               <w14:ligatures w14:val="standardContextual"/>
             </w:rPr>
           </w:pPr>
-          <w:hyperlink w:anchor="_Toc238635426" w:history="1">
+          <w:hyperlink w:anchor="_Toc239753750" w:history="1">
             <w:r>
               <w:rPr>
                 <w:rStyle w:val="Hyperlink"/>
@@ -2911,7 +3133,7 @@
                 <w:noProof/>
                 <w:webHidden/>
               </w:rPr>
-              <w:instrText xml:space="preserve"> PAGEREF _Toc238635426 \h </w:instrText>
+              <w:instrText xml:space="preserve"> PAGEREF _Toc239753750 \h </w:instrText>
             </w:r>
             <w:r>
               <w:rPr>
@@ -2931,7 +3153,7 @@
                 <w:noProof/>
                 <w:webHidden/>
               </w:rPr>
-              <w:t>16</w:t>
+              <w:t>18</w:t>
             </w:r>
             <w:r>
               <w:rPr>
@@ -2958,7 +3180,7 @@
               <w14:ligatures w14:val="standardContextual"/>
             </w:rPr>
           </w:pPr>
-          <w:hyperlink w:anchor="_Toc238635427" w:history="1">
+          <w:hyperlink w:anchor="_Toc239753751" w:history="1">
             <w:r>
               <w:rPr>
                 <w:rStyle w:val="Hyperlink"/>
@@ -2985,7 +3207,7 @@
                 <w:noProof/>
                 <w:webHidden/>
               </w:rPr>
-              <w:instrText xml:space="preserve"> PAGEREF _Toc238635427 \h </w:instrText>
+              <w:instrText xml:space="preserve"> PAGEREF _Toc239753751 \h </w:instrText>
             </w:r>
             <w:r>
               <w:rPr>
@@ -3005,7 +3227,7 @@
                 <w:noProof/>
                 <w:webHidden/>
               </w:rPr>
-              <w:t>18</w:t>
+              <w:t>20</w:t>
             </w:r>
             <w:r>
               <w:rPr>
@@ -3032,7 +3254,7 @@
               <w14:ligatures w14:val="standardContextual"/>
             </w:rPr>
           </w:pPr>
-          <w:hyperlink w:anchor="_Toc238635428" w:history="1">
+          <w:hyperlink w:anchor="_Toc239753752" w:history="1">
             <w:r>
               <w:rPr>
                 <w:rStyle w:val="Hyperlink"/>
@@ -3059,7 +3281,7 @@
                 <w:noProof/>
                 <w:webHidden/>
               </w:rPr>
-              <w:instrText xml:space="preserve"> PAGEREF _Toc238635428 \h </w:instrText>
+              <w:instrText xml:space="preserve"> PAGEREF _Toc239753752 \h </w:instrText>
             </w:r>
             <w:r>
               <w:rPr>
@@ -3079,7 +3301,7 @@
                 <w:noProof/>
                 <w:webHidden/>
               </w:rPr>
-              <w:t>18</w:t>
+              <w:t>20</w:t>
             </w:r>
             <w:r>
               <w:rPr>
@@ -3106,7 +3328,7 @@
               <w14:ligatures w14:val="standardContextual"/>
             </w:rPr>
           </w:pPr>
-          <w:hyperlink w:anchor="_Toc238635429" w:history="1">
+          <w:hyperlink w:anchor="_Toc239753753" w:history="1">
             <w:r>
               <w:rPr>
                 <w:rStyle w:val="Hyperlink"/>
@@ -3134,7 +3356,7 @@
                 <w:noProof/>
                 <w:webHidden/>
               </w:rPr>
-              <w:instrText xml:space="preserve"> PAGEREF _Toc238635429 \h </w:instrText>
+              <w:instrText xml:space="preserve"> PAGEREF _Toc239753753 \h </w:instrText>
             </w:r>
             <w:r>
               <w:rPr>
@@ -3154,7 +3376,7 @@
                 <w:noProof/>
                 <w:webHidden/>
               </w:rPr>
-              <w:t>20</w:t>
+              <w:t>22</w:t>
             </w:r>
             <w:r>
               <w:rPr>
@@ -3181,7 +3403,7 @@
               <w14:ligatures w14:val="standardContextual"/>
             </w:rPr>
           </w:pPr>
-          <w:hyperlink w:anchor="_Toc238635430" w:history="1">
+          <w:hyperlink w:anchor="_Toc239753754" w:history="1">
             <w:r>
               <w:rPr>
                 <w:rStyle w:val="Hyperlink"/>
@@ -3209,7 +3431,7 @@
                 <w:noProof/>
                 <w:webHidden/>
               </w:rPr>
-              <w:instrText xml:space="preserve"> PAGEREF _Toc238635430 \h </w:instrText>
+              <w:instrText xml:space="preserve"> PAGEREF _Toc239753754 \h </w:instrText>
             </w:r>
             <w:r>
               <w:rPr>
@@ -3229,7 +3451,7 @@
                 <w:noProof/>
                 <w:webHidden/>
               </w:rPr>
-              <w:t>20</w:t>
+              <w:t>22</w:t>
             </w:r>
             <w:r>
               <w:rPr>
@@ -3256,7 +3478,7 @@
               <w14:ligatures w14:val="standardContextual"/>
             </w:rPr>
           </w:pPr>
-          <w:hyperlink w:anchor="_Toc238635431" w:history="1">
+          <w:hyperlink w:anchor="_Toc239753755" w:history="1">
             <w:r>
               <w:rPr>
                 <w:rStyle w:val="Hyperlink"/>
@@ -3284,7 +3506,7 @@
                 <w:noProof/>
                 <w:webHidden/>
               </w:rPr>
-              <w:instrText xml:space="preserve"> PAGEREF _Toc238635431 \h </w:instrText>
+              <w:instrText xml:space="preserve"> PAGEREF _Toc239753755 \h </w:instrText>
             </w:r>
             <w:r>
               <w:rPr>
@@ -3304,7 +3526,7 @@
                 <w:noProof/>
                 <w:webHidden/>
               </w:rPr>
-              <w:t>20</w:t>
+              <w:t>22</w:t>
             </w:r>
             <w:r>
               <w:rPr>
@@ -3331,7 +3553,7 @@
               <w14:ligatures w14:val="standardContextual"/>
             </w:rPr>
           </w:pPr>
-          <w:hyperlink w:anchor="_Toc238635432" w:history="1">
+          <w:hyperlink w:anchor="_Toc239753756" w:history="1">
             <w:r>
               <w:rPr>
                 <w:rStyle w:val="Hyperlink"/>
@@ -3359,7 +3581,7 @@
                 <w:noProof/>
                 <w:webHidden/>
               </w:rPr>
-              <w:instrText xml:space="preserve"> PAGEREF _Toc238635432 \h </w:instrText>
+              <w:instrText xml:space="preserve"> PAGEREF _Toc239753756 \h </w:instrText>
             </w:r>
             <w:r>
               <w:rPr>
@@ -3379,7 +3601,7 @@
                 <w:noProof/>
                 <w:webHidden/>
               </w:rPr>
-              <w:t>20</w:t>
+              <w:t>22</w:t>
             </w:r>
             <w:r>
               <w:rPr>
@@ -3406,7 +3628,7 @@
               <w14:ligatures w14:val="standardContextual"/>
             </w:rPr>
           </w:pPr>
-          <w:hyperlink w:anchor="_Toc238635433" w:history="1">
+          <w:hyperlink w:anchor="_Toc239753757" w:history="1">
             <w:r>
               <w:rPr>
                 <w:rStyle w:val="Hyperlink"/>
@@ -3434,7 +3656,7 @@
                 <w:noProof/>
                 <w:webHidden/>
               </w:rPr>
-              <w:instrText xml:space="preserve"> PAGEREF _Toc238635433 \h </w:instrText>
+              <w:instrText xml:space="preserve"> PAGEREF _Toc239753757 \h </w:instrText>
             </w:r>
             <w:r>
               <w:rPr>
@@ -3454,7 +3676,7 @@
                 <w:noProof/>
                 <w:webHidden/>
               </w:rPr>
-              <w:t>20</w:t>
+              <w:t>22</w:t>
             </w:r>
             <w:r>
               <w:rPr>
@@ -3514,11 +3736,14 @@
       <w:pPr>
         <w:pStyle w:val="Heading1"/>
       </w:pPr>
-      <w:bookmarkStart w:id="0" w:name="_Toc238635404"/>
+      <w:bookmarkStart w:id="0" w:name="_Toc239753725"/>
       <w:r>
         <w:t>Introduction</w:t>
       </w:r>
       <w:bookmarkEnd w:id="0"/>
+      <w:r>
+        <w:t xml:space="preserve"> </w:t>
+      </w:r>
     </w:p>
     <w:p>
       <w:r>
@@ -3704,7 +3929,7 @@
       <w:pPr>
         <w:pStyle w:val="Heading1"/>
       </w:pPr>
-      <w:bookmarkStart w:id="1" w:name="_Toc238635405"/>
+      <w:bookmarkStart w:id="1" w:name="_Toc239753726"/>
       <w:r>
         <w:t xml:space="preserve">Getting </w:t>
       </w:r>
@@ -3754,7 +3979,7 @@
       <w:pPr>
         <w:pStyle w:val="Heading3"/>
       </w:pPr>
-      <w:bookmarkStart w:id="2" w:name="_Toc238635406"/>
+      <w:bookmarkStart w:id="2" w:name="_Toc239753727"/>
       <w:r>
         <w:t xml:space="preserve">Installing the </w:t>
       </w:r>
@@ -3776,6 +4001,16 @@
       <w:bookmarkEnd w:id="2"/>
     </w:p>
     <w:p>
+      <w:r>
+        <w:rPr>
+          <w:b/>
+          <w:bCs/>
+        </w:rPr>
+        <w:t>NOTE:</w:t>
+      </w:r>
+      <w:r>
+        <w:t xml:space="preserve"> </w:t>
+      </w:r>
       <w:r>
         <w:t xml:space="preserve">If you have </w:t>
       </w:r>
@@ -4125,7 +4360,7 @@
       <w:pPr>
         <w:pStyle w:val="Heading3"/>
       </w:pPr>
-      <w:bookmarkStart w:id="3" w:name="_Toc238635407"/>
+      <w:bookmarkStart w:id="3" w:name="_Toc239753728"/>
       <w:r>
         <w:t>Removing the Template</w:t>
       </w:r>
@@ -4294,7 +4529,7 @@
       <w:pPr>
         <w:pStyle w:val="Heading3"/>
       </w:pPr>
-      <w:bookmarkStart w:id="4" w:name="_Toc238635408"/>
+      <w:bookmarkStart w:id="4" w:name="_Toc239753729"/>
       <w:r>
         <w:lastRenderedPageBreak/>
         <w:t>The ASCOM Library</w:t>
@@ -4585,7 +4820,7 @@
       <w:pPr>
         <w:pStyle w:val="Heading1"/>
       </w:pPr>
-      <w:bookmarkStart w:id="5" w:name="_Toc238635409"/>
+      <w:bookmarkStart w:id="5" w:name="_Toc239753730"/>
       <w:r>
         <w:t xml:space="preserve">Template </w:t>
       </w:r>
@@ -4643,7 +4878,21 @@
     </w:p>
     <w:p>
       <w:r>
-        <w:t xml:space="preserve">Note: </w:t>
+        <w:rPr>
+          <w:b/>
+          <w:bCs/>
+        </w:rPr>
+        <w:t>NOTE</w:t>
+      </w:r>
+      <w:r>
+        <w:rPr>
+          <w:b/>
+          <w:bCs/>
+        </w:rPr>
+        <w:t>:</w:t>
+      </w:r>
+      <w:r>
+        <w:t xml:space="preserve"> </w:t>
       </w:r>
       <w:r>
         <w:t xml:space="preserve"> </w:t>
@@ -4899,15 +5148,63 @@
     </w:p>
     <w:p>
       <w:r>
-        <w:t>Note: Use double quotes around parameter values that contain spaces.</w:t>
+        <w:rPr>
+          <w:b/>
+          <w:bCs/>
+        </w:rPr>
+        <w:t>NOTE</w:t>
+      </w:r>
+      <w:r>
+        <w:rPr>
+          <w:b/>
+          <w:bCs/>
+        </w:rPr>
+        <w:t>:</w:t>
+      </w:r>
+      <w:r>
+        <w:t xml:space="preserve"> Use double quotes around parameter values that contain spaces.</w:t>
+      </w:r>
+    </w:p>
+    <w:p>
+      <w:r>
+        <w:t>A PDF copy of this document can be found in the project’s CustomisationHelp folder</w:t>
+      </w:r>
+      <w:r>
+        <w:t>,</w:t>
+      </w:r>
+      <w:r>
+        <w:t xml:space="preserve"> and the Alpaca API definition is here: </w:t>
+      </w:r>
+      <w:hyperlink r:id="rId21" w:history="1">
+        <w:r>
+          <w:rPr>
+            <w:rStyle w:val="Hyperlink"/>
+          </w:rPr>
+          <w:t>https://ascom-standards.org/api</w:t>
+        </w:r>
+      </w:hyperlink>
+      <w:r>
+        <w:t xml:space="preserve">. In addition, the ASCOM API canonical definitions can be found here: </w:t>
+      </w:r>
+      <w:hyperlink r:id="rId22" w:history="1">
+        <w:r>
+          <w:rPr>
+            <w:rStyle w:val="Hyperlink"/>
+          </w:rPr>
+          <w:t>https://ascom-standards.org/newdocs</w:t>
+        </w:r>
+      </w:hyperlink>
+      <w:r>
+        <w:t>.</w:t>
       </w:r>
     </w:p>
     <w:p>
       <w:pPr>
         <w:pStyle w:val="Heading1"/>
       </w:pPr>
-      <w:bookmarkStart w:id="6" w:name="_Toc238635410"/>
-      <w:r>
+      <w:bookmarkStart w:id="6" w:name="_Toc239753731"/>
+      <w:r>
+        <w:lastRenderedPageBreak/>
         <w:t xml:space="preserve">Creating </w:t>
       </w:r>
       <w:r>
@@ -4928,6 +5225,10 @@
       <w:bookmarkEnd w:id="6"/>
     </w:p>
     <w:p>
+      <w:pPr>
+        <w:keepNext/>
+        <w:keepLines/>
+      </w:pPr>
       <w:r>
         <w:t xml:space="preserve">The </w:t>
       </w:r>
@@ -4938,6 +5239,8 @@
     <w:p>
       <w:pPr>
         <w:pStyle w:val="ListParagraph"/>
+        <w:keepNext/>
+        <w:keepLines/>
         <w:numPr>
           <w:ilvl w:val="0"/>
           <w:numId w:val="5"/>
@@ -5085,6 +5388,10 @@
       </w:r>
     </w:p>
     <w:p>
+      <w:pPr>
+        <w:keepNext/>
+        <w:keepLines/>
+      </w:pPr>
       <w:r>
         <w:t xml:space="preserve">The </w:t>
       </w:r>
@@ -5106,14 +5413,50 @@
       <w:r>
         <w:t>an editor of your choice.</w:t>
       </w:r>
+      <w:r>
+        <w:t xml:space="preserve"> </w:t>
+      </w:r>
+    </w:p>
+    <w:p>
+      <w:pPr>
+        <w:keepNext/>
+        <w:keepLines/>
+      </w:pPr>
+      <w:r>
+        <w:rPr>
+          <w:b/>
+          <w:bCs/>
+        </w:rPr>
+        <w:t>NOTE:</w:t>
+      </w:r>
+      <w:r>
+        <w:t xml:space="preserve"> </w:t>
+      </w:r>
+      <w:r>
+        <w:t>O</w:t>
+      </w:r>
+      <w:r>
+        <w:t xml:space="preserve">n closing Visual Studio, you will be asked to save the project’s solution file that </w:t>
+      </w:r>
+      <w:r>
+        <w:t xml:space="preserve">was created </w:t>
+      </w:r>
+      <w:r>
+        <w:t xml:space="preserve">automatically </w:t>
+      </w:r>
+      <w:r>
+        <w:t>by Visual Studio</w:t>
+      </w:r>
+      <w:r>
+        <w:t>.</w:t>
+      </w:r>
     </w:p>
     <w:p>
       <w:pPr>
         <w:pStyle w:val="Heading1"/>
       </w:pPr>
-      <w:bookmarkStart w:id="7" w:name="_Toc238635411"/>
-      <w:r>
-        <w:lastRenderedPageBreak/>
+      <w:bookmarkStart w:id="7" w:name="_Toc239753732"/>
+      <w:r>
         <w:t xml:space="preserve">Project </w:t>
       </w:r>
       <w:r>
@@ -5243,9 +5586,9 @@
           <w:noProof/>
         </w:rPr>
         <w:drawing>
-          <wp:inline distT="0" distB="0" distL="0" distR="0" wp14:anchorId="46650620" wp14:editId="49D21438">
-            <wp:extent cx="1652460" cy="3594100"/>
-            <wp:effectExtent l="0" t="0" r="5080" b="6350"/>
+          <wp:inline distT="0" distB="0" distL="0" distR="0" wp14:anchorId="46650620" wp14:editId="28ECE74B">
+            <wp:extent cx="1574029" cy="3423513"/>
+            <wp:effectExtent l="0" t="0" r="7620" b="5715"/>
             <wp:docPr id="318220235" name="Picture 1" descr="A screenshot of a computer&#10;&#10;AI-generated content may be incorrect."/>
             <wp:cNvGraphicFramePr>
               <a:graphicFrameLocks xmlns:a="http://schemas.openxmlformats.org/drawingml/2006/main" noChangeAspect="1"/>
@@ -5258,7 +5601,7 @@
                     <pic:cNvPicPr/>
                   </pic:nvPicPr>
                   <pic:blipFill>
-                    <a:blip r:embed="rId21"/>
+                    <a:blip r:embed="rId23"/>
                     <a:stretch>
                       <a:fillRect/>
                     </a:stretch>
@@ -5266,7 +5609,7 @@
                   <pic:spPr>
                     <a:xfrm>
                       <a:off x="0" y="0"/>
-                      <a:ext cx="1660775" cy="3612185"/>
+                      <a:ext cx="1589178" cy="3456462"/>
                     </a:xfrm>
                     <a:prstGeom prst="rect">
                       <a:avLst/>
@@ -5283,7 +5626,7 @@
       <w:pPr>
         <w:pStyle w:val="Heading1"/>
       </w:pPr>
-      <w:bookmarkStart w:id="8" w:name="_Toc238635412"/>
+      <w:bookmarkStart w:id="8" w:name="_Toc239753733"/>
       <w:r>
         <w:t xml:space="preserve">Optimal </w:t>
       </w:r>
@@ -5311,7 +5654,7 @@
       <w:r>
         <w:t xml:space="preserve">To aid developers, ASCOM publishes the Conform Universal tool that exercises each API member independently and reports on conformance with the relevant interface standard. You can download Conform Universal from this page: </w:t>
       </w:r>
-      <w:hyperlink r:id="rId22" w:history="1">
+      <w:hyperlink r:id="rId24" w:history="1">
         <w:r>
           <w:rPr>
             <w:rStyle w:val="Hyperlink"/>
@@ -5324,13 +5667,20 @@
       </w:r>
     </w:p>
     <w:p>
-      <w:r>
+      <w:pPr>
+        <w:keepNext/>
+        <w:keepLines/>
+      </w:pPr>
+      <w:r>
+        <w:lastRenderedPageBreak/>
         <w:t>The best approach to creating your Alpaca device to is to implement in the following order:</w:t>
       </w:r>
     </w:p>
     <w:p>
       <w:pPr>
         <w:pStyle w:val="ListParagraph"/>
+        <w:keepNext/>
+        <w:keepLines/>
         <w:numPr>
           <w:ilvl w:val="0"/>
           <w:numId w:val="7"/>
@@ -5347,6 +5697,8 @@
     <w:p>
       <w:pPr>
         <w:pStyle w:val="ListParagraph"/>
+        <w:keepNext/>
+        <w:keepLines/>
         <w:numPr>
           <w:ilvl w:val="1"/>
           <w:numId w:val="7"/>
@@ -5359,6 +5711,8 @@
     <w:p>
       <w:pPr>
         <w:pStyle w:val="ListParagraph"/>
+        <w:keepNext/>
+        <w:keepLines/>
         <w:numPr>
           <w:ilvl w:val="1"/>
           <w:numId w:val="6"/>
@@ -5423,6 +5777,8 @@
     <w:p>
       <w:pPr>
         <w:pStyle w:val="ListParagraph"/>
+        <w:keepNext/>
+        <w:keepLines/>
         <w:numPr>
           <w:ilvl w:val="0"/>
           <w:numId w:val="7"/>
@@ -5443,6 +5799,8 @@
     <w:p>
       <w:pPr>
         <w:pStyle w:val="ListParagraph"/>
+        <w:keepNext/>
+        <w:keepLines/>
         <w:numPr>
           <w:ilvl w:val="1"/>
           <w:numId w:val="7"/>
@@ -5455,6 +5813,8 @@
     <w:p>
       <w:pPr>
         <w:pStyle w:val="ListParagraph"/>
+        <w:keepNext/>
+        <w:keepLines/>
         <w:numPr>
           <w:ilvl w:val="0"/>
           <w:numId w:val="7"/>
@@ -5489,6 +5849,8 @@
     <w:p>
       <w:pPr>
         <w:pStyle w:val="ListParagraph"/>
+        <w:keepNext/>
+        <w:keepLines/>
         <w:numPr>
           <w:ilvl w:val="1"/>
           <w:numId w:val="7"/>
@@ -5502,9 +5864,8 @@
       <w:pPr>
         <w:pStyle w:val="Heading1"/>
       </w:pPr>
-      <w:bookmarkStart w:id="9" w:name="_Toc238635413"/>
-      <w:r>
-        <w:lastRenderedPageBreak/>
+      <w:bookmarkStart w:id="9" w:name="_Toc239753734"/>
+      <w:r>
         <w:t>How t</w:t>
       </w:r>
       <w:r>
@@ -5838,7 +6199,7 @@
                     <pic:cNvPicPr/>
                   </pic:nvPicPr>
                   <pic:blipFill>
-                    <a:blip r:embed="rId23"/>
+                    <a:blip r:embed="rId25"/>
                     <a:stretch>
                       <a:fillRect/>
                     </a:stretch>
@@ -5998,7 +6359,7 @@
       <w:r>
         <w:t xml:space="preserve">access the device e.g. </w:t>
       </w:r>
-      <w:hyperlink r:id="rId24" w:history="1">
+      <w:hyperlink r:id="rId26" w:history="1">
         <w:r>
           <w:rPr>
             <w:rStyle w:val="Hyperlink"/>
@@ -6243,7 +6604,7 @@
                     </pic:cNvPicPr>
                   </pic:nvPicPr>
                   <pic:blipFill>
-                    <a:blip r:embed="rId25" cstate="print">
+                    <a:blip r:embed="rId27" cstate="print">
                       <a:extLst>
                         <a:ext uri="{28A0092B-C50C-407E-A947-70E740481C1C}">
                           <a14:useLocalDpi xmlns:a14="http://schemas.microsoft.com/office/drawing/2010/main" val="0"/>
@@ -6296,7 +6657,7 @@
                     <pic:cNvPicPr/>
                   </pic:nvPicPr>
                   <pic:blipFill>
-                    <a:blip r:embed="rId26"/>
+                    <a:blip r:embed="rId28"/>
                     <a:stretch>
                       <a:fillRect/>
                     </a:stretch>
@@ -6321,14 +6682,15 @@
       <w:pPr>
         <w:pStyle w:val="Heading1"/>
       </w:pPr>
-      <w:bookmarkStart w:id="10" w:name="_Ref208473771"/>
-      <w:bookmarkStart w:id="11" w:name="_Toc238635414"/>
+      <w:bookmarkStart w:id="10" w:name="_Toc239753735"/>
+      <w:bookmarkStart w:id="11" w:name="_Ref208473771"/>
       <w:r>
         <w:t xml:space="preserve">Implementing </w:t>
       </w:r>
       <w:r>
         <w:t>the connection management members</w:t>
       </w:r>
+      <w:bookmarkEnd w:id="10"/>
     </w:p>
     <w:p>
       <w:r>
@@ -6885,14 +7247,15 @@
       <w:pPr>
         <w:pStyle w:val="Heading1"/>
       </w:pPr>
+      <w:bookmarkStart w:id="12" w:name="_Toc239753736"/>
       <w:r>
         <w:t xml:space="preserve">Implementing </w:t>
       </w:r>
       <w:r>
         <w:t>the hardware interface</w:t>
       </w:r>
-      <w:bookmarkEnd w:id="10"/>
       <w:bookmarkEnd w:id="11"/>
+      <w:bookmarkEnd w:id="12"/>
     </w:p>
     <w:p>
       <w:pPr>
@@ -7096,11 +7459,11 @@
       <w:pPr>
         <w:pStyle w:val="Heading1"/>
       </w:pPr>
-      <w:bookmarkStart w:id="12" w:name="_Toc238635415"/>
+      <w:bookmarkStart w:id="13" w:name="_Toc239753737"/>
       <w:r>
         <w:t>How to view Alpaca protocol messages</w:t>
       </w:r>
-      <w:bookmarkEnd w:id="12"/>
+      <w:bookmarkEnd w:id="13"/>
     </w:p>
     <w:p>
       <w:r>
@@ -7202,7 +7565,7 @@
       <w:pPr>
         <w:pStyle w:val="Heading1"/>
       </w:pPr>
-      <w:bookmarkStart w:id="13" w:name="_Toc238635416"/>
+      <w:bookmarkStart w:id="14" w:name="_Toc239753738"/>
       <w:r>
         <w:t xml:space="preserve">How to </w:t>
       </w:r>
@@ -7236,7 +7599,7 @@
       <w:r>
         <w:t>ardware</w:t>
       </w:r>
-      <w:bookmarkEnd w:id="13"/>
+      <w:bookmarkEnd w:id="14"/>
     </w:p>
     <w:p>
       <w:r>
@@ -9285,7 +9648,7 @@
       <w:pPr>
         <w:pStyle w:val="Heading1"/>
       </w:pPr>
-      <w:bookmarkStart w:id="14" w:name="_Toc238635417"/>
+      <w:bookmarkStart w:id="15" w:name="_Toc239753739"/>
       <w:r>
         <w:t xml:space="preserve">How to </w:t>
       </w:r>
@@ -9313,7 +9676,7 @@
       <w:r>
         <w:t>ardware</w:t>
       </w:r>
-      <w:bookmarkEnd w:id="14"/>
+      <w:bookmarkEnd w:id="15"/>
     </w:p>
     <w:p>
       <w:pPr>
@@ -10536,12 +10899,16 @@
       </w:r>
     </w:p>
     <w:p>
+      <w:bookmarkStart w:id="16" w:name="_Ref206758028"/>
+    </w:p>
+    <w:p>
       <w:pPr>
         <w:pStyle w:val="Heading1"/>
-      </w:pPr>
-      <w:bookmarkStart w:id="15" w:name="_Ref206758028"/>
-      <w:bookmarkStart w:id="16" w:name="_Toc238635418"/>
-      <w:r>
+        <w:widowControl w:val="0"/>
+      </w:pPr>
+      <w:bookmarkStart w:id="17" w:name="_Toc239753740"/>
+      <w:r>
+        <w:lastRenderedPageBreak/>
         <w:t xml:space="preserve">How to </w:t>
       </w:r>
       <w:r>
@@ -10577,10 +10944,15 @@
       <w:r>
         <w:t>etting</w:t>
       </w:r>
-      <w:bookmarkEnd w:id="15"/>
       <w:bookmarkEnd w:id="16"/>
-    </w:p>
-    <w:p>
+      <w:bookmarkEnd w:id="17"/>
+    </w:p>
+    <w:p>
+      <w:pPr>
+        <w:keepNext/>
+        <w:keepLines/>
+        <w:widowControl w:val="0"/>
+      </w:pPr>
       <w:r>
         <w:t xml:space="preserve">Configuration settings </w:t>
       </w:r>
@@ -10649,6 +11021,9 @@
     <w:p>
       <w:pPr>
         <w:pStyle w:val="ListParagraph"/>
+        <w:keepNext/>
+        <w:keepLines/>
+        <w:widowControl w:val="0"/>
         <w:numPr>
           <w:ilvl w:val="0"/>
           <w:numId w:val="9"/>
@@ -10711,6 +11086,9 @@
     <w:p>
       <w:pPr>
         <w:pStyle w:val="ListParagraph"/>
+        <w:keepNext/>
+        <w:keepLines/>
+        <w:widowControl w:val="0"/>
         <w:numPr>
           <w:ilvl w:val="0"/>
           <w:numId w:val="9"/>
@@ -10774,6 +11152,11 @@
       </w:r>
     </w:p>
     <w:p>
+      <w:pPr>
+        <w:keepNext/>
+        <w:keepLines/>
+        <w:widowControl w:val="0"/>
+      </w:pPr>
       <w:r>
         <w:t xml:space="preserve">This </w:t>
       </w:r>
@@ -10789,6 +11172,9 @@
     </w:p>
     <w:p>
       <w:pPr>
+        <w:keepNext/>
+        <w:keepLines/>
+        <w:widowControl w:val="0"/>
         <w:autoSpaceDE w:val="0"/>
         <w:autoSpaceDN w:val="0"/>
         <w:adjustRightInd w:val="0"/>
@@ -10834,6 +11220,9 @@
     </w:p>
     <w:p>
       <w:pPr>
+        <w:keepNext/>
+        <w:keepLines/>
+        <w:widowControl w:val="0"/>
         <w:autoSpaceDE w:val="0"/>
         <w:autoSpaceDN w:val="0"/>
         <w:adjustRightInd w:val="0"/>
@@ -10869,6 +11258,9 @@
     </w:p>
     <w:p>
       <w:pPr>
+        <w:keepNext/>
+        <w:keepLines/>
+        <w:widowControl w:val="0"/>
         <w:autoSpaceDE w:val="0"/>
         <w:autoSpaceDN w:val="0"/>
         <w:adjustRightInd w:val="0"/>
@@ -10914,6 +11306,9 @@
     </w:p>
     <w:p>
       <w:pPr>
+        <w:keepNext/>
+        <w:keepLines/>
+        <w:widowControl w:val="0"/>
         <w:autoSpaceDE w:val="0"/>
         <w:autoSpaceDN w:val="0"/>
         <w:adjustRightInd w:val="0"/>
@@ -10979,6 +11374,9 @@
     </w:p>
     <w:p>
       <w:pPr>
+        <w:keepNext/>
+        <w:keepLines/>
+        <w:widowControl w:val="0"/>
         <w:autoSpaceDE w:val="0"/>
         <w:autoSpaceDN w:val="0"/>
         <w:adjustRightInd w:val="0"/>
@@ -11054,6 +11452,9 @@
     </w:p>
     <w:p>
       <w:pPr>
+        <w:keepNext/>
+        <w:keepLines/>
+        <w:widowControl w:val="0"/>
         <w:autoSpaceDE w:val="0"/>
         <w:autoSpaceDN w:val="0"/>
         <w:adjustRightInd w:val="0"/>
@@ -11079,6 +11480,9 @@
     </w:p>
     <w:p>
       <w:pPr>
+        <w:keepNext/>
+        <w:keepLines/>
+        <w:widowControl w:val="0"/>
         <w:autoSpaceDE w:val="0"/>
         <w:autoSpaceDN w:val="0"/>
         <w:adjustRightInd w:val="0"/>
@@ -11114,6 +11518,9 @@
     </w:p>
     <w:p>
       <w:pPr>
+        <w:keepNext/>
+        <w:keepLines/>
+        <w:widowControl w:val="0"/>
         <w:autoSpaceDE w:val="0"/>
         <w:autoSpaceDN w:val="0"/>
         <w:adjustRightInd w:val="0"/>
@@ -11139,6 +11546,9 @@
     </w:p>
     <w:p>
       <w:pPr>
+        <w:keepNext/>
+        <w:keepLines/>
+        <w:widowControl w:val="0"/>
         <w:autoSpaceDE w:val="0"/>
         <w:autoSpaceDN w:val="0"/>
         <w:adjustRightInd w:val="0"/>
@@ -11174,6 +11584,9 @@
     </w:p>
     <w:p>
       <w:pPr>
+        <w:keepNext/>
+        <w:keepLines/>
+        <w:widowControl w:val="0"/>
         <w:autoSpaceDE w:val="0"/>
         <w:autoSpaceDN w:val="0"/>
         <w:adjustRightInd w:val="0"/>
@@ -11319,6 +11732,9 @@
     </w:p>
     <w:p>
       <w:pPr>
+        <w:keepNext/>
+        <w:keepLines/>
+        <w:widowControl w:val="0"/>
         <w:autoSpaceDE w:val="0"/>
         <w:autoSpaceDN w:val="0"/>
         <w:adjustRightInd w:val="0"/>
@@ -11344,6 +11760,9 @@
     </w:p>
     <w:p>
       <w:pPr>
+        <w:keepNext/>
+        <w:keepLines/>
+        <w:widowControl w:val="0"/>
         <w:autoSpaceDE w:val="0"/>
         <w:autoSpaceDN w:val="0"/>
         <w:adjustRightInd w:val="0"/>
@@ -11389,6 +11808,9 @@
     </w:p>
     <w:p>
       <w:pPr>
+        <w:keepNext/>
+        <w:keepLines/>
+        <w:widowControl w:val="0"/>
         <w:autoSpaceDE w:val="0"/>
         <w:autoSpaceDN w:val="0"/>
         <w:adjustRightInd w:val="0"/>
@@ -11414,6 +11836,9 @@
     </w:p>
     <w:p>
       <w:pPr>
+        <w:keepNext/>
+        <w:keepLines/>
+        <w:widowControl w:val="0"/>
         <w:autoSpaceDE w:val="0"/>
         <w:autoSpaceDN w:val="0"/>
         <w:adjustRightInd w:val="0"/>
@@ -11429,6 +11854,9 @@
     </w:p>
     <w:p>
       <w:pPr>
+        <w:keepNext/>
+        <w:keepLines/>
+        <w:widowControl w:val="0"/>
         <w:autoSpaceDE w:val="0"/>
         <w:autoSpaceDN w:val="0"/>
         <w:adjustRightInd w:val="0"/>
@@ -11464,6 +11892,9 @@
     </w:p>
     <w:p>
       <w:pPr>
+        <w:keepNext/>
+        <w:keepLines/>
+        <w:widowControl w:val="0"/>
         <w:autoSpaceDE w:val="0"/>
         <w:autoSpaceDN w:val="0"/>
         <w:adjustRightInd w:val="0"/>
@@ -11529,6 +11960,9 @@
     </w:p>
     <w:p>
       <w:pPr>
+        <w:keepNext/>
+        <w:keepLines/>
+        <w:widowControl w:val="0"/>
         <w:autoSpaceDE w:val="0"/>
         <w:autoSpaceDN w:val="0"/>
         <w:adjustRightInd w:val="0"/>
@@ -11554,6 +11988,9 @@
     </w:p>
     <w:p>
       <w:pPr>
+        <w:keepNext/>
+        <w:keepLines/>
+        <w:widowControl w:val="0"/>
         <w:autoSpaceDE w:val="0"/>
         <w:autoSpaceDN w:val="0"/>
         <w:adjustRightInd w:val="0"/>
@@ -11574,7 +12011,6 @@
           <w:szCs w:val="16"/>
           <w:highlight w:val="white"/>
         </w:rPr>
-        <w:lastRenderedPageBreak/>
         <w:t xml:space="preserve">       </w:t>
       </w:r>
       <w:r>
@@ -11590,6 +12026,9 @@
     </w:p>
     <w:p>
       <w:pPr>
+        <w:keepNext/>
+        <w:keepLines/>
+        <w:widowControl w:val="0"/>
         <w:autoSpaceDE w:val="0"/>
         <w:autoSpaceDN w:val="0"/>
         <w:adjustRightInd w:val="0"/>
@@ -11615,6 +12054,9 @@
     </w:p>
     <w:p>
       <w:pPr>
+        <w:keepNext/>
+        <w:keepLines/>
+        <w:widowControl w:val="0"/>
         <w:autoSpaceDE w:val="0"/>
         <w:autoSpaceDN w:val="0"/>
         <w:adjustRightInd w:val="0"/>
@@ -11650,6 +12092,9 @@
     </w:p>
     <w:p>
       <w:pPr>
+        <w:keepNext/>
+        <w:keepLines/>
+        <w:widowControl w:val="0"/>
         <w:autoSpaceDE w:val="0"/>
         <w:autoSpaceDN w:val="0"/>
         <w:adjustRightInd w:val="0"/>
@@ -11715,6 +12160,9 @@
     </w:p>
     <w:p>
       <w:pPr>
+        <w:keepNext/>
+        <w:keepLines/>
+        <w:widowControl w:val="0"/>
         <w:autoSpaceDE w:val="0"/>
         <w:autoSpaceDN w:val="0"/>
         <w:adjustRightInd w:val="0"/>
@@ -11740,6 +12188,9 @@
     </w:p>
     <w:p>
       <w:pPr>
+        <w:keepNext/>
+        <w:keepLines/>
+        <w:widowControl w:val="0"/>
         <w:autoSpaceDE w:val="0"/>
         <w:autoSpaceDN w:val="0"/>
         <w:adjustRightInd w:val="0"/>
@@ -11765,6 +12216,9 @@
     </w:p>
     <w:p>
       <w:pPr>
+        <w:keepNext/>
+        <w:keepLines/>
+        <w:widowControl w:val="0"/>
         <w:autoSpaceDE w:val="0"/>
         <w:autoSpaceDN w:val="0"/>
         <w:adjustRightInd w:val="0"/>
@@ -11779,6 +12233,11 @@
       </w:pPr>
     </w:p>
     <w:p>
+      <w:pPr>
+        <w:keepNext/>
+        <w:keepLines/>
+        <w:widowControl w:val="0"/>
+      </w:pPr>
       <w:r>
         <w:t xml:space="preserve">See the </w:t>
       </w:r>
@@ -11815,7 +12274,7 @@
       <w:pPr>
         <w:pStyle w:val="Heading1"/>
       </w:pPr>
-      <w:bookmarkStart w:id="17" w:name="_Toc238635419"/>
+      <w:bookmarkStart w:id="18" w:name="_Toc239753741"/>
       <w:r>
         <w:t>How to add a</w:t>
       </w:r>
@@ -11834,7 +12293,7 @@
       <w:r>
         <w:t>UI.</w:t>
       </w:r>
-      <w:bookmarkEnd w:id="17"/>
+      <w:bookmarkEnd w:id="18"/>
     </w:p>
     <w:p>
       <w:r>
@@ -12100,10 +12559,12 @@
     <w:p>
       <w:pPr>
         <w:pStyle w:val="Heading1"/>
-      </w:pPr>
-      <w:bookmarkStart w:id="18" w:name="_Ref212370588"/>
-      <w:bookmarkStart w:id="19" w:name="_Toc238635420"/>
-      <w:r>
+        <w:widowControl w:val="0"/>
+      </w:pPr>
+      <w:bookmarkStart w:id="19" w:name="_Ref212370588"/>
+      <w:bookmarkStart w:id="20" w:name="_Toc239753742"/>
+      <w:r>
+        <w:lastRenderedPageBreak/>
         <w:t xml:space="preserve">How to </w:t>
       </w:r>
       <w:r>
@@ -12118,11 +12579,14 @@
       <w:r>
         <w:t>ecurity</w:t>
       </w:r>
-      <w:bookmarkEnd w:id="18"/>
       <w:bookmarkEnd w:id="19"/>
-    </w:p>
-    <w:p>
-      <w:pPr>
+      <w:bookmarkEnd w:id="20"/>
+    </w:p>
+    <w:p>
+      <w:pPr>
+        <w:keepNext/>
+        <w:keepLines/>
+        <w:widowControl w:val="0"/>
         <w:rPr>
           <w:i/>
           <w:iCs/>
@@ -12196,6 +12660,11 @@
       </w:r>
     </w:p>
     <w:p>
+      <w:pPr>
+        <w:keepNext/>
+        <w:keepLines/>
+        <w:widowControl w:val="0"/>
+      </w:pPr>
       <w:r>
         <w:t>The driver template offers several security features</w:t>
       </w:r>
@@ -12280,6 +12749,9 @@
     </w:p>
     <w:p>
       <w:pPr>
+        <w:keepNext/>
+        <w:keepLines/>
+        <w:widowControl w:val="0"/>
         <w:jc w:val="center"/>
       </w:pPr>
       <w:r>
@@ -12304,7 +12776,7 @@
                     </pic:cNvPicPr>
                   </pic:nvPicPr>
                   <pic:blipFill>
-                    <a:blip r:embed="rId27">
+                    <a:blip r:embed="rId29">
                       <a:extLst>
                         <a:ext uri="{28A0092B-C50C-407E-A947-70E740481C1C}">
                           <a14:useLocalDpi xmlns:a14="http://schemas.microsoft.com/office/drawing/2010/main" val="0"/>
@@ -12334,6 +12806,11 @@
       </w:r>
     </w:p>
     <w:p>
+      <w:pPr>
+        <w:keepNext/>
+        <w:keepLines/>
+        <w:widowControl w:val="0"/>
+      </w:pPr>
       <w:r>
         <w:t>Once enabled</w:t>
       </w:r>
@@ -12363,6 +12840,11 @@
       </w:r>
     </w:p>
     <w:p>
+      <w:pPr>
+        <w:keepNext/>
+        <w:keepLines/>
+        <w:widowControl w:val="0"/>
+      </w:pPr>
       <w:r>
         <w:t xml:space="preserve">To </w:t>
       </w:r>
@@ -12463,6 +12945,11 @@
       </w:r>
     </w:p>
     <w:p>
+      <w:pPr>
+        <w:keepNext/>
+        <w:keepLines/>
+        <w:widowControl w:val="0"/>
+      </w:pPr>
       <w:r>
         <w:t xml:space="preserve">The </w:t>
       </w:r>
@@ -12582,8 +13069,8 @@
       <w:pPr>
         <w:pStyle w:val="Heading1"/>
       </w:pPr>
-      <w:r>
-        <w:lastRenderedPageBreak/>
+      <w:bookmarkStart w:id="21" w:name="_Toc239753743"/>
+      <w:r>
         <w:t xml:space="preserve">How to </w:t>
       </w:r>
       <w:r>
@@ -12595,6 +13082,7 @@
       <w:r>
         <w:t>shutdown timeout</w:t>
       </w:r>
+      <w:bookmarkEnd w:id="21"/>
     </w:p>
     <w:p>
       <w:pPr>
@@ -12713,7 +13201,7 @@
                     <pic:cNvPicPr/>
                   </pic:nvPicPr>
                   <pic:blipFill>
-                    <a:blip r:embed="rId28"/>
+                    <a:blip r:embed="rId30"/>
                     <a:stretch>
                       <a:fillRect/>
                     </a:stretch>
@@ -12734,19 +13222,274 @@
         </w:drawing>
       </w:r>
     </w:p>
-    <w:p/>
-    <w:p>
-      <w:pPr>
-        <w:rPr>
-          <w:i/>
-          <w:iCs/>
+    <w:p>
+      <w:pPr>
+        <w:pStyle w:val="Heading1"/>
+      </w:pPr>
+      <w:bookmarkStart w:id="22" w:name="_Toc239753744"/>
+      <w:r>
+        <w:lastRenderedPageBreak/>
+        <w:t>Configuring device defaults</w:t>
+      </w:r>
+      <w:bookmarkEnd w:id="22"/>
+    </w:p>
+    <w:p>
+      <w:pPr>
+        <w:keepNext/>
+        <w:keepLines/>
+      </w:pPr>
+      <w:r>
+        <w:t>The following default</w:t>
+      </w:r>
+      <w:r>
+        <w:t xml:space="preserve"> behaviours </w:t>
+      </w:r>
+      <w:r>
+        <w:t xml:space="preserve"> can be configured </w:t>
+      </w:r>
+      <w:r>
+        <w:t>by setting defaults in the ServerSettings class:</w:t>
+      </w:r>
+    </w:p>
+    <w:p>
+      <w:pPr>
+        <w:pStyle w:val="ListParagraph"/>
+        <w:keepNext/>
+        <w:keepLines/>
+        <w:numPr>
+          <w:ilvl w:val="0"/>
+          <w:numId w:val="17"/>
+        </w:numPr>
+      </w:pPr>
+      <w:r>
+        <w:t>The name of the file that stores settings – default: Server</w:t>
+      </w:r>
+    </w:p>
+    <w:p>
+      <w:pPr>
+        <w:pStyle w:val="ListParagraph"/>
+        <w:keepNext/>
+        <w:keepLines/>
+        <w:numPr>
+          <w:ilvl w:val="0"/>
+          <w:numId w:val="17"/>
+        </w:numPr>
+      </w:pPr>
+      <w:r>
+        <w:t>Observatory location – default: My Observatory</w:t>
+      </w:r>
+    </w:p>
+    <w:p>
+      <w:pPr>
+        <w:pStyle w:val="ListParagraph"/>
+        <w:keepNext/>
+        <w:keepLines/>
+        <w:numPr>
+          <w:ilvl w:val="0"/>
+          <w:numId w:val="17"/>
+        </w:numPr>
+      </w:pPr>
+      <w:r>
+        <w:t>Whether to open a browser window when the application starts.</w:t>
+      </w:r>
+    </w:p>
+    <w:p>
+      <w:pPr>
+        <w:pStyle w:val="ListParagraph"/>
+        <w:keepNext/>
+        <w:keepLines/>
+        <w:numPr>
+          <w:ilvl w:val="0"/>
+          <w:numId w:val="17"/>
+        </w:numPr>
+      </w:pPr>
+      <w:r>
+        <w:t>The IP port number on which the Alpaca device operates</w:t>
+      </w:r>
+    </w:p>
+    <w:p>
+      <w:pPr>
+        <w:pStyle w:val="ListParagraph"/>
+        <w:keepNext/>
+        <w:keepLines/>
+        <w:numPr>
+          <w:ilvl w:val="0"/>
+          <w:numId w:val="17"/>
+        </w:numPr>
+      </w:pPr>
+      <w:r>
+        <w:t>Whether to allow access from other devices when started</w:t>
+      </w:r>
+    </w:p>
+    <w:p>
+      <w:pPr>
+        <w:pStyle w:val="ListParagraph"/>
+        <w:keepNext/>
+        <w:keepLines/>
+        <w:numPr>
+          <w:ilvl w:val="0"/>
+          <w:numId w:val="17"/>
+        </w:numPr>
+      </w:pPr>
+      <w:r>
+        <w:t>Whether to respond to Alpaca discovery requests</w:t>
+      </w:r>
+    </w:p>
+    <w:p>
+      <w:pPr>
+        <w:pStyle w:val="ListParagraph"/>
+        <w:keepNext/>
+        <w:keepLines/>
+        <w:numPr>
+          <w:ilvl w:val="0"/>
+          <w:numId w:val="17"/>
+        </w:numPr>
+      </w:pPr>
+      <w:r>
+        <w:t>Whether to respond to discovery requests on localhost only or on all networks</w:t>
+      </w:r>
+    </w:p>
+    <w:p>
+      <w:pPr>
+        <w:pStyle w:val="ListParagraph"/>
+        <w:keepNext/>
+        <w:keepLines/>
+        <w:numPr>
+          <w:ilvl w:val="0"/>
+          <w:numId w:val="17"/>
+        </w:numPr>
+      </w:pPr>
+      <w:r>
+        <w:t>Whether to respect client disconnection requests or always stay connected.</w:t>
+      </w:r>
+    </w:p>
+    <w:p>
+      <w:pPr>
+        <w:pStyle w:val="ListParagraph"/>
+        <w:keepNext/>
+        <w:keepLines/>
+        <w:numPr>
+          <w:ilvl w:val="0"/>
+          <w:numId w:val="17"/>
+        </w:numPr>
+      </w:pPr>
+      <w:r>
+        <w:t>Whether to run the Swagger UI on HostIpAddress:AlpacaPort/swagger</w:t>
+      </w:r>
+    </w:p>
+    <w:p>
+      <w:pPr>
+        <w:pStyle w:val="ListParagraph"/>
+        <w:keepNext/>
+        <w:keepLines/>
+        <w:numPr>
+          <w:ilvl w:val="0"/>
+          <w:numId w:val="17"/>
+        </w:numPr>
+      </w:pPr>
+      <w:r>
+        <w:t>Whether to support the ImageBytes protocol (fast camera image download)</w:t>
+      </w:r>
+    </w:p>
+    <w:p>
+      <w:pPr>
+        <w:pStyle w:val="ListParagraph"/>
+        <w:keepNext/>
+        <w:keepLines/>
+        <w:numPr>
+          <w:ilvl w:val="0"/>
+          <w:numId w:val="17"/>
+        </w:numPr>
+      </w:pPr>
+      <w:r>
+        <w:t>Whether to operate in a strict interpretation of the Alpaca protocol</w:t>
+      </w:r>
+    </w:p>
+    <w:p>
+      <w:pPr>
+        <w:pStyle w:val="ListParagraph"/>
+        <w:keepNext/>
+        <w:keepLines/>
+        <w:numPr>
+          <w:ilvl w:val="0"/>
+          <w:numId w:val="17"/>
+        </w:numPr>
+      </w:pPr>
+      <w:r>
+        <w:t xml:space="preserve">Whether to require </w:t>
+      </w:r>
+      <w:r>
+        <w:t>authentication</w:t>
+      </w:r>
+      <w:r>
+        <w:t xml:space="preserve"> before access</w:t>
+      </w:r>
+    </w:p>
+    <w:p>
+      <w:pPr>
+        <w:pStyle w:val="ListParagraph"/>
+        <w:keepNext/>
+        <w:keepLines/>
+        <w:numPr>
+          <w:ilvl w:val="0"/>
+          <w:numId w:val="17"/>
+        </w:numPr>
+      </w:pPr>
+      <w:r>
+        <w:t>T</w:t>
+      </w:r>
+      <w:r>
+        <w:t>he login username</w:t>
+      </w:r>
+    </w:p>
+    <w:p>
+      <w:pPr>
+        <w:pStyle w:val="ListParagraph"/>
+        <w:keepNext/>
+        <w:keepLines/>
+        <w:numPr>
+          <w:ilvl w:val="0"/>
+          <w:numId w:val="17"/>
+        </w:numPr>
+      </w:pPr>
+      <w:r>
+        <w:t>T</w:t>
+      </w:r>
+      <w:r>
+        <w:t>he login password</w:t>
+      </w:r>
+    </w:p>
+    <w:p>
+      <w:pPr>
+        <w:pStyle w:val="ListParagraph"/>
+        <w:keepNext/>
+        <w:keepLines/>
+        <w:numPr>
+          <w:ilvl w:val="0"/>
+          <w:numId w:val="17"/>
+        </w:numPr>
+      </w:pPr>
+      <w:r>
+        <w:t>T</w:t>
+      </w:r>
+      <w:r>
+        <w:t xml:space="preserve">he log </w:t>
+      </w:r>
+      <w:r>
+        <w:t xml:space="preserve">message </w:t>
+      </w:r>
+      <w:r>
+        <w:t>level (information, debug etc)</w:t>
+      </w:r>
+    </w:p>
+    <w:p>
+      <w:pPr>
+        <w:rPr>
           <w:highlight w:val="yellow"/>
         </w:rPr>
       </w:pPr>
       <w:r>
         <w:rPr>
-          <w:i/>
-          <w:iCs/>
           <w:highlight w:val="yellow"/>
         </w:rPr>
         <w:br w:type="page"/>
@@ -12756,8 +13499,8 @@
       <w:pPr>
         <w:pStyle w:val="Heading1"/>
       </w:pPr>
-      <w:bookmarkStart w:id="20" w:name="_Ref206659244"/>
-      <w:bookmarkStart w:id="21" w:name="_Toc238635421"/>
+      <w:bookmarkStart w:id="23" w:name="_Ref206659244"/>
+      <w:bookmarkStart w:id="24" w:name="_Toc239753745"/>
       <w:r>
         <w:lastRenderedPageBreak/>
         <w:t xml:space="preserve">Appendix 1 </w:t>
@@ -12774,8 +13517,8 @@
       <w:r>
         <w:t>tructure</w:t>
       </w:r>
-      <w:bookmarkEnd w:id="20"/>
-      <w:bookmarkEnd w:id="21"/>
+      <w:bookmarkEnd w:id="23"/>
+      <w:bookmarkEnd w:id="24"/>
     </w:p>
     <w:p>
       <w:r>
@@ -12826,7 +13569,7 @@
                     <pic:cNvPicPr/>
                   </pic:nvPicPr>
                   <pic:blipFill>
-                    <a:blip r:embed="rId29">
+                    <a:blip r:embed="rId31">
                       <a:extLst>
                         <a:ext uri="{28A0092B-C50C-407E-A947-70E740481C1C}">
                           <a14:useLocalDpi xmlns:a14="http://schemas.microsoft.com/office/drawing/2010/main" val="0"/>
@@ -13079,26 +13822,387 @@
           <w:i/>
           <w:iCs/>
         </w:rPr>
-        <w:t>Implementing the hardware interface</w:t>
-      </w:r>
-      <w:r>
-        <w:rPr>
-          <w:i/>
-          <w:iCs/>
-        </w:rPr>
-        <w:fldChar w:fldCharType="end"/>
+        <w:t>Implementing the connection management</w:t>
+      </w:r>
+      <w:r>
+        <w:t xml:space="preserve"> members</w:t>
+      </w:r>
+    </w:p>
+    <w:p>
+      <w:r>
+        <w:t xml:space="preserve">ASCOM devices have historically used the synchronous </w:t>
+      </w:r>
+      <w:r>
+        <w:rPr>
+          <w:rFonts w:ascii="Consolas" w:hAnsi="Consolas"/>
+          <w:b/>
+          <w:bCs/>
+          <w:sz w:val="20"/>
+          <w:szCs w:val="20"/>
+        </w:rPr>
+        <w:t>Connected</w:t>
+      </w:r>
+      <w:r>
+        <w:t xml:space="preserve"> property to change the device’s connection state. With Platform 7 we introduced asynchronous connection through the </w:t>
+      </w:r>
+      <w:r>
+        <w:rPr>
+          <w:rFonts w:ascii="Consolas" w:hAnsi="Consolas"/>
+          <w:b/>
+          <w:bCs/>
+          <w:sz w:val="20"/>
+          <w:szCs w:val="20"/>
+        </w:rPr>
+        <w:t>Connect</w:t>
+      </w:r>
+      <w:r>
+        <w:t xml:space="preserve">(), </w:t>
+      </w:r>
+      <w:r>
+        <w:rPr>
+          <w:rFonts w:ascii="Consolas" w:hAnsi="Consolas"/>
+          <w:b/>
+          <w:bCs/>
+          <w:sz w:val="20"/>
+          <w:szCs w:val="20"/>
+        </w:rPr>
+        <w:t>Disconnect</w:t>
+      </w:r>
+      <w:r>
+        <w:t xml:space="preserve">() and </w:t>
+      </w:r>
+      <w:r>
+        <w:rPr>
+          <w:rFonts w:ascii="Consolas" w:hAnsi="Consolas"/>
+          <w:b/>
+          <w:bCs/>
+          <w:sz w:val="20"/>
+          <w:szCs w:val="20"/>
+        </w:rPr>
+        <w:t>Connecting</w:t>
+      </w:r>
+      <w:r>
+        <w:t xml:space="preserve"> members, where </w:t>
+      </w:r>
+      <w:r>
+        <w:rPr>
+          <w:rFonts w:ascii="Consolas" w:hAnsi="Consolas"/>
+          <w:b/>
+          <w:bCs/>
+          <w:sz w:val="20"/>
+          <w:szCs w:val="20"/>
+        </w:rPr>
+        <w:t>Connect</w:t>
+      </w:r>
+      <w:r>
+        <w:t xml:space="preserve">() and </w:t>
+      </w:r>
+      <w:r>
+        <w:rPr>
+          <w:rFonts w:ascii="Consolas" w:hAnsi="Consolas"/>
+          <w:b/>
+          <w:bCs/>
+          <w:sz w:val="20"/>
+          <w:szCs w:val="20"/>
+        </w:rPr>
+        <w:t>Disconnect</w:t>
+      </w:r>
+      <w:r>
+        <w:t xml:space="preserve">() are short lived initiators and </w:t>
+      </w:r>
+      <w:r>
+        <w:rPr>
+          <w:rFonts w:ascii="Consolas" w:hAnsi="Consolas"/>
+          <w:b/>
+          <w:bCs/>
+          <w:sz w:val="20"/>
+          <w:szCs w:val="20"/>
+        </w:rPr>
+        <w:t>Connecting</w:t>
+      </w:r>
+      <w:r>
+        <w:t xml:space="preserve"> is the completion variable that indicates whether the operation:</w:t>
+      </w:r>
+    </w:p>
+    <w:p>
+      <w:pPr>
+        <w:pStyle w:val="ListParagraph"/>
+        <w:numPr>
+          <w:ilvl w:val="0"/>
+          <w:numId w:val="16"/>
+        </w:numPr>
+      </w:pPr>
+      <w:r>
+        <w:t xml:space="preserve">is still running </w:t>
+      </w:r>
+      <w:r>
+        <w:sym w:font="Wingdings" w:char="F0E8"/>
       </w:r>
       <w:r>
         <w:t xml:space="preserve"> </w:t>
       </w:r>
       <w:r>
-        <w:t xml:space="preserve">for </w:t>
-      </w:r>
-      <w:r>
-        <w:t xml:space="preserve">information on </w:t>
-      </w:r>
-      <w:r>
-        <w:t>how to add further devices.</w:t>
+        <w:rPr>
+          <w:rFonts w:ascii="Consolas" w:hAnsi="Consolas"/>
+          <w:b/>
+          <w:bCs/>
+          <w:sz w:val="20"/>
+          <w:szCs w:val="20"/>
+        </w:rPr>
+        <w:t>Connecting</w:t>
+      </w:r>
+      <w:r>
+        <w:t xml:space="preserve"> </w:t>
+      </w:r>
+      <w:r>
+        <w:t xml:space="preserve">returns </w:t>
+      </w:r>
+      <w:r>
+        <w:rPr>
+          <w:b/>
+          <w:bCs/>
+          <w:color w:val="00B0F0"/>
+        </w:rPr>
+        <w:t>true</w:t>
+      </w:r>
+      <w:r>
+        <w:t>.</w:t>
+      </w:r>
+    </w:p>
+    <w:p>
+      <w:pPr>
+        <w:pStyle w:val="ListParagraph"/>
+        <w:numPr>
+          <w:ilvl w:val="0"/>
+          <w:numId w:val="16"/>
+        </w:numPr>
+      </w:pPr>
+      <w:r>
+        <w:t xml:space="preserve">has completed successfully </w:t>
+      </w:r>
+      <w:r>
+        <w:sym w:font="Wingdings" w:char="F0E8"/>
+      </w:r>
+      <w:r>
+        <w:t xml:space="preserve"> </w:t>
+      </w:r>
+      <w:r>
+        <w:rPr>
+          <w:rFonts w:ascii="Consolas" w:hAnsi="Consolas"/>
+          <w:b/>
+          <w:bCs/>
+          <w:sz w:val="20"/>
+          <w:szCs w:val="20"/>
+        </w:rPr>
+        <w:t>Connecting</w:t>
+      </w:r>
+      <w:r>
+        <w:t xml:space="preserve"> </w:t>
+      </w:r>
+      <w:r>
+        <w:t xml:space="preserve">returns </w:t>
+      </w:r>
+      <w:r>
+        <w:rPr>
+          <w:b/>
+          <w:bCs/>
+          <w:color w:val="00B0F0"/>
+        </w:rPr>
+        <w:t>false</w:t>
+      </w:r>
+      <w:r>
+        <w:t>.</w:t>
+      </w:r>
+    </w:p>
+    <w:p>
+      <w:pPr>
+        <w:pStyle w:val="ListParagraph"/>
+        <w:numPr>
+          <w:ilvl w:val="0"/>
+          <w:numId w:val="16"/>
+        </w:numPr>
+      </w:pPr>
+      <w:r>
+        <w:t xml:space="preserve">failed to complete </w:t>
+      </w:r>
+      <w:r>
+        <w:sym w:font="Wingdings" w:char="F0E8"/>
+      </w:r>
+      <w:r>
+        <w:t xml:space="preserve"> </w:t>
+      </w:r>
+      <w:r>
+        <w:rPr>
+          <w:rFonts w:ascii="Consolas" w:hAnsi="Consolas"/>
+          <w:b/>
+          <w:bCs/>
+          <w:sz w:val="20"/>
+          <w:szCs w:val="20"/>
+        </w:rPr>
+        <w:t>Connecting</w:t>
+      </w:r>
+      <w:r>
+        <w:t xml:space="preserve"> </w:t>
+      </w:r>
+      <w:r>
+        <w:rPr>
+          <w:b/>
+          <w:bCs/>
+          <w:color w:val="00B0F0"/>
+        </w:rPr>
+        <w:t>throws an exception</w:t>
+      </w:r>
+      <w:r>
+        <w:rPr>
+          <w:color w:val="00B0F0"/>
+        </w:rPr>
+        <w:t xml:space="preserve"> </w:t>
+      </w:r>
+      <w:r>
+        <w:t>describing what happened.</w:t>
+      </w:r>
+    </w:p>
+    <w:p>
+      <w:r>
+        <w:t>Boilerplate code for handling the four connection members is available in the example safety monitor device that is provided in the template. We recommend that you cut and paste this code into your new device to replace the same named members created when the interface was implemented.</w:t>
+      </w:r>
+    </w:p>
+    <w:p>
+      <w:r>
+        <w:t xml:space="preserve">The device’s communication code only needs to be implemented once each in the </w:t>
+      </w:r>
+      <w:r>
+        <w:rPr>
+          <w:rFonts w:ascii="Consolas" w:hAnsi="Consolas"/>
+          <w:b/>
+          <w:bCs/>
+          <w:sz w:val="20"/>
+          <w:szCs w:val="20"/>
+        </w:rPr>
+        <w:t>Connect</w:t>
+      </w:r>
+      <w:r>
+        <w:t xml:space="preserve">() and </w:t>
+      </w:r>
+      <w:r>
+        <w:rPr>
+          <w:rFonts w:ascii="Consolas" w:hAnsi="Consolas"/>
+          <w:b/>
+          <w:bCs/>
+          <w:sz w:val="20"/>
+          <w:szCs w:val="20"/>
+        </w:rPr>
+        <w:t>Disconnect</w:t>
+      </w:r>
+      <w:r>
+        <w:t xml:space="preserve">() methods because the </w:t>
+      </w:r>
+      <w:r>
+        <w:rPr>
+          <w:rFonts w:ascii="Consolas" w:hAnsi="Consolas"/>
+          <w:b/>
+          <w:bCs/>
+          <w:sz w:val="20"/>
+          <w:szCs w:val="20"/>
+        </w:rPr>
+        <w:t>Connected</w:t>
+      </w:r>
+      <w:r>
+        <w:t xml:space="preserve"> </w:t>
+      </w:r>
+      <w:r>
+        <w:rPr>
+          <w:rFonts w:ascii="Consolas" w:hAnsi="Consolas"/>
+          <w:b/>
+          <w:bCs/>
+          <w:sz w:val="20"/>
+          <w:szCs w:val="20"/>
+        </w:rPr>
+        <w:t>Set</w:t>
+      </w:r>
+      <w:r>
+        <w:t xml:space="preserve"> property uses </w:t>
+      </w:r>
+      <w:r>
+        <w:rPr>
+          <w:rFonts w:ascii="Consolas" w:hAnsi="Consolas"/>
+          <w:b/>
+          <w:bCs/>
+          <w:sz w:val="20"/>
+          <w:szCs w:val="20"/>
+        </w:rPr>
+        <w:t>Connect</w:t>
+      </w:r>
+      <w:r>
+        <w:t xml:space="preserve">(), </w:t>
+      </w:r>
+      <w:r>
+        <w:rPr>
+          <w:rFonts w:ascii="Consolas" w:hAnsi="Consolas"/>
+          <w:b/>
+          <w:bCs/>
+          <w:sz w:val="20"/>
+          <w:szCs w:val="20"/>
+        </w:rPr>
+        <w:t>Disconnect</w:t>
+      </w:r>
+      <w:r>
+        <w:t xml:space="preserve">() and </w:t>
+      </w:r>
+      <w:r>
+        <w:rPr>
+          <w:rFonts w:ascii="Consolas" w:hAnsi="Consolas"/>
+          <w:b/>
+          <w:bCs/>
+          <w:sz w:val="20"/>
+          <w:szCs w:val="20"/>
+        </w:rPr>
+        <w:t>Connecting</w:t>
+      </w:r>
+      <w:r>
+        <w:t xml:space="preserve"> under the hood. The places to add your code in </w:t>
+      </w:r>
+      <w:r>
+        <w:rPr>
+          <w:rFonts w:ascii="Consolas" w:hAnsi="Consolas"/>
+          <w:b/>
+          <w:bCs/>
+          <w:sz w:val="20"/>
+          <w:szCs w:val="20"/>
+        </w:rPr>
+        <w:t>Connect</w:t>
+      </w:r>
+      <w:r>
+        <w:t xml:space="preserve">() and </w:t>
+      </w:r>
+      <w:r>
+        <w:rPr>
+          <w:rFonts w:ascii="Consolas" w:hAnsi="Consolas"/>
+          <w:b/>
+          <w:bCs/>
+          <w:sz w:val="20"/>
+          <w:szCs w:val="20"/>
+        </w:rPr>
+        <w:t>Disconnect</w:t>
+      </w:r>
+      <w:r>
+        <w:t xml:space="preserve">() are marked with </w:t>
+      </w:r>
+      <w:r>
+        <w:rPr>
+          <w:rFonts w:ascii="Consolas" w:hAnsi="Consolas"/>
+          <w:b/>
+          <w:bCs/>
+          <w:sz w:val="20"/>
+          <w:szCs w:val="20"/>
+        </w:rPr>
+        <w:t>TODO: Add your device connection code here.</w:t>
+      </w:r>
+      <w:r>
+        <w:t xml:space="preserve"> </w:t>
+      </w:r>
+      <w:r>
+        <w:t>comments.</w:t>
       </w:r>
     </w:p>
     <w:p>
@@ -13110,20 +14214,26 @@
         </w:numPr>
       </w:pPr>
       <w:r>
-        <w:rPr>
-          <w:b/>
-          <w:bCs/>
-        </w:rPr>
-        <w:t xml:space="preserve">Pages/Devices </w:t>
-      </w:r>
-      <w:r>
-        <w:t xml:space="preserve">– The Devices folder </w:t>
-      </w:r>
-      <w:r>
-        <w:t>holds basic</w:t>
-      </w:r>
-      <w:r>
-        <w:t xml:space="preserve"> configuration pages for all device types</w:t>
+        <w:t>Implementing the hardware interface</w:t>
+      </w:r>
+      <w:r>
+        <w:rPr>
+          <w:i/>
+          <w:iCs/>
+        </w:rPr>
+        <w:fldChar w:fldCharType="end"/>
+      </w:r>
+      <w:r>
+        <w:t xml:space="preserve"> </w:t>
+      </w:r>
+      <w:r>
+        <w:t xml:space="preserve">for </w:t>
+      </w:r>
+      <w:r>
+        <w:t xml:space="preserve">information on </w:t>
+      </w:r>
+      <w:r>
+        <w:t>how to add further devices.</w:t>
       </w:r>
     </w:p>
     <w:p>
@@ -13139,23 +14249,16 @@
           <w:b/>
           <w:bCs/>
         </w:rPr>
-        <w:t>Pages/_Host</w:t>
-      </w:r>
-      <w:r>
-        <w:rPr>
-          <w:b/>
-          <w:bCs/>
-        </w:rPr>
-        <w:t>.cshtml</w:t>
-      </w:r>
-      <w:r>
-        <w:t xml:space="preserve"> – HTML page that acts as the host page for the Blazor single page application. You should only need to </w:t>
-      </w:r>
-      <w:r>
-        <w:t>revise</w:t>
-      </w:r>
-      <w:r>
-        <w:t xml:space="preserve"> this in advanced scenarios.</w:t>
+        <w:t xml:space="preserve">Pages/Devices </w:t>
+      </w:r>
+      <w:r>
+        <w:t xml:space="preserve">– The Devices folder </w:t>
+      </w:r>
+      <w:r>
+        <w:t>holds basic</w:t>
+      </w:r>
+      <w:r>
+        <w:t xml:space="preserve"> configuration pages for all device types</w:t>
       </w:r>
     </w:p>
     <w:p>
@@ -13171,7 +14274,7 @@
           <w:b/>
           <w:bCs/>
         </w:rPr>
-        <w:t>Pages/_Layout</w:t>
+        <w:t>Pages/_Host</w:t>
       </w:r>
       <w:r>
         <w:rPr>
@@ -13181,7 +14284,13 @@
         <w:t>.cshtml</w:t>
       </w:r>
       <w:r>
-        <w:t xml:space="preserve"> – HTML page setting out the overall structure of the rendered page including common content e.g. CSS scripts that are available in every page of the application.</w:t>
+        <w:t xml:space="preserve"> – HTML page that acts as the host page for the Blazor single page application. You should only need to </w:t>
+      </w:r>
+      <w:r>
+        <w:t>revise</w:t>
+      </w:r>
+      <w:r>
+        <w:t xml:space="preserve"> this in advanced scenarios.</w:t>
       </w:r>
     </w:p>
     <w:p>
@@ -13197,7 +14306,7 @@
           <w:b/>
           <w:bCs/>
         </w:rPr>
-        <w:t>Pages/Error</w:t>
+        <w:t>Pages/_Layout</w:t>
       </w:r>
       <w:r>
         <w:rPr>
@@ -13207,7 +14316,7 @@
         <w:t>.cshtml</w:t>
       </w:r>
       <w:r>
-        <w:t xml:space="preserve"> – Error page for use in the development environment.</w:t>
+        <w:t xml:space="preserve"> – HTML page setting out the overall structure of the rendered page including common content e.g. CSS scripts that are available in every page of the application.</w:t>
       </w:r>
     </w:p>
     <w:p>
@@ -13223,17 +14332,17 @@
           <w:b/>
           <w:bCs/>
         </w:rPr>
-        <w:t>Pages/Index</w:t>
+        <w:t>Pages/Error</w:t>
       </w:r>
       <w:r>
         <w:rPr>
           <w:b/>
           <w:bCs/>
         </w:rPr>
-        <w:t>.razor</w:t>
-      </w:r>
-      <w:r>
-        <w:t xml:space="preserve"> – Home page for the application</w:t>
+        <w:t>.cshtml</w:t>
+      </w:r>
+      <w:r>
+        <w:t xml:space="preserve"> – Error page for use in the development environment.</w:t>
       </w:r>
     </w:p>
     <w:p>
@@ -13249,7 +14358,7 @@
           <w:b/>
           <w:bCs/>
         </w:rPr>
-        <w:t>Pages/Setup</w:t>
+        <w:t>Pages/Index</w:t>
       </w:r>
       <w:r>
         <w:rPr>
@@ -13259,13 +14368,7 @@
         <w:t>.razor</w:t>
       </w:r>
       <w:r>
-        <w:t xml:space="preserve"> – Device’s </w:t>
-      </w:r>
-      <w:r>
-        <w:t xml:space="preserve">top-level </w:t>
-      </w:r>
-      <w:r>
-        <w:t>configuration page</w:t>
+        <w:t xml:space="preserve"> – Home page for the application</w:t>
       </w:r>
     </w:p>
     <w:p>
@@ -13281,7 +14384,7 @@
           <w:b/>
           <w:bCs/>
         </w:rPr>
-        <w:t>Shared/MainLayout</w:t>
+        <w:t>Pages/Setup</w:t>
       </w:r>
       <w:r>
         <w:rPr>
@@ -13291,7 +14394,13 @@
         <w:t>.razor</w:t>
       </w:r>
       <w:r>
-        <w:t xml:space="preserve"> – Overall layout for common elements of the browser page including the page header, navigation and page content areas. Usually, you won’t need to change this file.</w:t>
+        <w:t xml:space="preserve"> – Device’s </w:t>
+      </w:r>
+      <w:r>
+        <w:t xml:space="preserve">top-level </w:t>
+      </w:r>
+      <w:r>
+        <w:t>configuration page</w:t>
       </w:r>
     </w:p>
     <w:p>
@@ -13307,7 +14416,7 @@
           <w:b/>
           <w:bCs/>
         </w:rPr>
-        <w:t>Shared/NavMenu</w:t>
+        <w:t>Shared/MainLayout</w:t>
       </w:r>
       <w:r>
         <w:rPr>
@@ -13317,7 +14426,7 @@
         <w:t>.razor</w:t>
       </w:r>
       <w:r>
-        <w:t xml:space="preserve"> – This creates the navigation menu including items like device setup and individual configuration pages for all available devices. Usually, you won’t need to change this file.</w:t>
+        <w:t xml:space="preserve"> – Overall layout for common elements of the browser page including the page header, navigation and page content areas. Usually, you won’t need to change this file.</w:t>
       </w:r>
     </w:p>
     <w:p>
@@ -13333,7 +14442,8 @@
           <w:b/>
           <w:bCs/>
         </w:rPr>
-        <w:t>_imports</w:t>
+        <w:lastRenderedPageBreak/>
+        <w:t>Shared/NavMenu</w:t>
       </w:r>
       <w:r>
         <w:rPr>
@@ -13343,17 +14453,7 @@
         <w:t>.razor</w:t>
       </w:r>
       <w:r>
-        <w:rPr>
-          <w:b/>
-          <w:bCs/>
-        </w:rPr>
-        <w:t xml:space="preserve"> – </w:t>
-      </w:r>
-      <w:r>
-        <w:t>Common</w:t>
-      </w:r>
-      <w:r>
-        <w:t xml:space="preserve"> Blazor using statements that should be available on all razor pages</w:t>
+        <w:t xml:space="preserve"> – This creates the navigation menu including items like device setup and individual configuration pages for all available devices. Usually, you won’t need to change this file.</w:t>
       </w:r>
     </w:p>
     <w:p>
@@ -13369,17 +14469,27 @@
           <w:b/>
           <w:bCs/>
         </w:rPr>
-        <w:t>AlpacaConfiguration.</w:t>
+        <w:t>_imports</w:t>
       </w:r>
       <w:r>
         <w:rPr>
           <w:b/>
           <w:bCs/>
         </w:rPr>
-        <w:t>cs</w:t>
-      </w:r>
-      <w:r>
-        <w:t xml:space="preserve"> – Defines configuration values for the Alpaca device itself e.g. IP port, manufacturer name, server version and location that will be loaded from and persisted to permanent storage. Define device specific configuration values in ServerSettings.cs rather than in AlpacaConfiguration.cs.</w:t>
+        <w:t>.razor</w:t>
+      </w:r>
+      <w:r>
+        <w:rPr>
+          <w:b/>
+          <w:bCs/>
+        </w:rPr>
+        <w:t xml:space="preserve"> – </w:t>
+      </w:r>
+      <w:r>
+        <w:t>Common</w:t>
+      </w:r>
+      <w:r>
+        <w:t xml:space="preserve"> Blazor using statements that should be available on all razor pages</w:t>
       </w:r>
     </w:p>
     <w:p>
@@ -13395,17 +14505,17 @@
           <w:b/>
           <w:bCs/>
         </w:rPr>
-        <w:t>App.</w:t>
+        <w:t>AlpacaConfiguration.</w:t>
       </w:r>
       <w:r>
         <w:rPr>
           <w:b/>
           <w:bCs/>
         </w:rPr>
-        <w:t>razor</w:t>
-      </w:r>
-      <w:r>
-        <w:t xml:space="preserve"> – The root component of the application. Usually, you won’t need to change this file.</w:t>
+        <w:t>cs</w:t>
+      </w:r>
+      <w:r>
+        <w:t xml:space="preserve"> – Defines configuration values for the Alpaca device itself e.g. IP port, manufacturer name, server version and location that will be loaded from and persisted to permanent storage. Define device specific configuration values in ServerSettings.cs rather than in AlpacaConfiguration.cs.</w:t>
       </w:r>
     </w:p>
     <w:p>
@@ -13421,16 +14531,42 @@
           <w:b/>
           <w:bCs/>
         </w:rPr>
-        <w:t>Appsettings</w:t>
-      </w:r>
-      <w:r>
-        <w:t>.</w:t>
+        <w:t>App.</w:t>
       </w:r>
       <w:r>
         <w:rPr>
           <w:b/>
           <w:bCs/>
         </w:rPr>
+        <w:t>razor</w:t>
+      </w:r>
+      <w:r>
+        <w:t xml:space="preserve"> – The root component of the application. Usually, you won’t need to change this file.</w:t>
+      </w:r>
+    </w:p>
+    <w:p>
+      <w:pPr>
+        <w:pStyle w:val="ListParagraph"/>
+        <w:numPr>
+          <w:ilvl w:val="0"/>
+          <w:numId w:val="5"/>
+        </w:numPr>
+      </w:pPr>
+      <w:r>
+        <w:rPr>
+          <w:b/>
+          <w:bCs/>
+        </w:rPr>
+        <w:t>Appsettings</w:t>
+      </w:r>
+      <w:r>
+        <w:t>.</w:t>
+      </w:r>
+      <w:r>
+        <w:rPr>
+          <w:b/>
+          <w:bCs/>
+        </w:rPr>
         <w:t>json</w:t>
       </w:r>
       <w:r>
@@ -13439,7 +14575,7 @@
       <w:r>
         <w:t>The appsettings.json file in </w:t>
       </w:r>
-      <w:hyperlink r:id="rId30" w:history="1">
+      <w:hyperlink r:id="rId32" w:history="1">
         <w:r>
           <w:rPr>
             <w:rStyle w:val="Hyperlink"/>
@@ -13550,7 +14686,6 @@
           <w:b/>
           <w:bCs/>
         </w:rPr>
-        <w:lastRenderedPageBreak/>
         <w:t>ServerSettings.</w:t>
       </w:r>
       <w:r>
@@ -13601,8 +14736,8 @@
       <w:pPr>
         <w:pStyle w:val="Heading1"/>
       </w:pPr>
-      <w:bookmarkStart w:id="22" w:name="_Ref206756317"/>
-      <w:bookmarkStart w:id="23" w:name="_Toc238635422"/>
+      <w:bookmarkStart w:id="25" w:name="_Ref206756317"/>
+      <w:bookmarkStart w:id="26" w:name="_Toc239753746"/>
       <w:r>
         <w:lastRenderedPageBreak/>
         <w:t xml:space="preserve">Appendix 2 </w:t>
@@ -13616,8 +14751,8 @@
       <w:r>
         <w:t>Example Razor setup page</w:t>
       </w:r>
-      <w:bookmarkEnd w:id="22"/>
-      <w:bookmarkEnd w:id="23"/>
+      <w:bookmarkEnd w:id="25"/>
+      <w:bookmarkEnd w:id="26"/>
     </w:p>
     <w:p>
       <w:pPr>
@@ -19601,8 +20736,8 @@
           <w:highlight w:val="white"/>
         </w:rPr>
       </w:pPr>
-      <w:bookmarkStart w:id="24" w:name="_Ref207806592"/>
-      <w:bookmarkStart w:id="25" w:name="_Toc238635423"/>
+      <w:bookmarkStart w:id="27" w:name="_Ref207806592"/>
+      <w:bookmarkStart w:id="28" w:name="_Toc239753747"/>
       <w:r>
         <w:rPr>
           <w:highlight w:val="white"/>
@@ -19640,8 +20775,8 @@
         </w:rPr>
         <w:t>WireShark</w:t>
       </w:r>
-      <w:bookmarkEnd w:id="24"/>
-      <w:bookmarkEnd w:id="25"/>
+      <w:bookmarkEnd w:id="27"/>
+      <w:bookmarkEnd w:id="28"/>
       <w:r>
         <w:rPr>
           <w:highlight w:val="white"/>
@@ -19653,16 +20788,16 @@
       <w:pPr>
         <w:pStyle w:val="Heading2"/>
       </w:pPr>
-      <w:bookmarkStart w:id="26" w:name="_Toc131600800"/>
-      <w:bookmarkStart w:id="27" w:name="_Toc238635424"/>
+      <w:bookmarkStart w:id="29" w:name="_Toc131600800"/>
+      <w:bookmarkStart w:id="30" w:name="_Toc239753748"/>
       <w:r>
         <w:t>Installing Wireshark and Setting Privileges</w:t>
       </w:r>
-      <w:bookmarkEnd w:id="26"/>
+      <w:bookmarkEnd w:id="29"/>
       <w:r>
         <w:t xml:space="preserve"> on a Raspberry Pi</w:t>
       </w:r>
-      <w:bookmarkEnd w:id="27"/>
+      <w:bookmarkEnd w:id="30"/>
     </w:p>
     <w:p>
       <w:r>
@@ -19740,7 +20875,7 @@
                     </pic:cNvPicPr>
                   </pic:nvPicPr>
                   <pic:blipFill>
-                    <a:blip r:embed="rId31" cstate="print"/>
+                    <a:blip r:embed="rId33" cstate="print"/>
                     <a:srcRect/>
                     <a:stretch>
                       <a:fillRect/>
@@ -19866,7 +21001,7 @@
                     </pic:cNvPicPr>
                   </pic:nvPicPr>
                   <pic:blipFill>
-                    <a:blip r:embed="rId32" cstate="print"/>
+                    <a:blip r:embed="rId34" cstate="print"/>
                     <a:srcRect/>
                     <a:stretch>
                       <a:fillRect/>
@@ -19899,11 +21034,11 @@
       <w:pPr>
         <w:pStyle w:val="Heading2"/>
       </w:pPr>
-      <w:bookmarkStart w:id="28" w:name="_Toc238635425"/>
+      <w:bookmarkStart w:id="31" w:name="_Toc239753749"/>
       <w:r>
         <w:t>Checking the Wireshark Installation on the Raspberry Pi</w:t>
       </w:r>
-      <w:bookmarkEnd w:id="28"/>
+      <w:bookmarkEnd w:id="31"/>
     </w:p>
     <w:p>
       <w:r>
@@ -19934,7 +21069,7 @@
                     </pic:cNvPicPr>
                   </pic:nvPicPr>
                   <pic:blipFill>
-                    <a:blip r:embed="rId33" cstate="print"/>
+                    <a:blip r:embed="rId35" cstate="print"/>
                     <a:srcRect/>
                     <a:stretch>
                       <a:fillRect/>
@@ -20073,13 +21208,13 @@
       <w:pPr>
         <w:pStyle w:val="Heading2"/>
       </w:pPr>
-      <w:bookmarkStart w:id="29" w:name="_Toc238635426"/>
-      <w:bookmarkStart w:id="30" w:name="_Toc131600801"/>
+      <w:bookmarkStart w:id="32" w:name="_Toc239753750"/>
+      <w:bookmarkStart w:id="33" w:name="_Toc131600801"/>
       <w:r>
         <w:lastRenderedPageBreak/>
         <w:t>Installing WireShark on Windows</w:t>
       </w:r>
-      <w:bookmarkEnd w:id="29"/>
+      <w:bookmarkEnd w:id="32"/>
     </w:p>
     <w:p>
       <w:pPr>
@@ -20103,7 +21238,7 @@
       <w:r>
         <w:t xml:space="preserve"> </w:t>
       </w:r>
-      <w:hyperlink r:id="rId34" w:history="1">
+      <w:hyperlink r:id="rId36" w:history="1">
         <w:r>
           <w:rPr>
             <w:rStyle w:val="Hyperlink"/>
@@ -20143,94 +21278,6 @@
                 <pic:pic xmlns:pic="http://schemas.openxmlformats.org/drawingml/2006/picture">
                   <pic:nvPicPr>
                     <pic:cNvPr id="901861975" name=""/>
-                    <pic:cNvPicPr/>
-                  </pic:nvPicPr>
-                  <pic:blipFill>
-                    <a:blip r:embed="rId35"/>
-                    <a:stretch>
-                      <a:fillRect/>
-                    </a:stretch>
-                  </pic:blipFill>
-                  <pic:spPr>
-                    <a:xfrm>
-                      <a:off x="0" y="0"/>
-                      <a:ext cx="2880000" cy="2239200"/>
-                    </a:xfrm>
-                    <a:prstGeom prst="rect">
-                      <a:avLst/>
-                    </a:prstGeom>
-                  </pic:spPr>
-                </pic:pic>
-              </a:graphicData>
-            </a:graphic>
-          </wp:inline>
-        </w:drawing>
-      </w:r>
-      <w:r>
-        <w:t xml:space="preserve">     </w:t>
-      </w:r>
-      <w:r>
-        <w:rPr>
-          <w:noProof/>
-        </w:rPr>
-        <w:drawing>
-          <wp:inline distT="0" distB="0" distL="0" distR="0" wp14:anchorId="62CAF537" wp14:editId="58867CEC">
-            <wp:extent cx="2880000" cy="2239200"/>
-            <wp:effectExtent l="0" t="0" r="0" b="8890"/>
-            <wp:docPr id="117568169" name="Picture 1"/>
-            <wp:cNvGraphicFramePr>
-              <a:graphicFrameLocks xmlns:a="http://schemas.openxmlformats.org/drawingml/2006/main" noChangeAspect="1"/>
-            </wp:cNvGraphicFramePr>
-            <a:graphic xmlns:a="http://schemas.openxmlformats.org/drawingml/2006/main">
-              <a:graphicData uri="http://schemas.openxmlformats.org/drawingml/2006/picture">
-                <pic:pic xmlns:pic="http://schemas.openxmlformats.org/drawingml/2006/picture">
-                  <pic:nvPicPr>
-                    <pic:cNvPr id="117568169" name=""/>
-                    <pic:cNvPicPr/>
-                  </pic:nvPicPr>
-                  <pic:blipFill>
-                    <a:blip r:embed="rId36"/>
-                    <a:stretch>
-                      <a:fillRect/>
-                    </a:stretch>
-                  </pic:blipFill>
-                  <pic:spPr>
-                    <a:xfrm>
-                      <a:off x="0" y="0"/>
-                      <a:ext cx="2880000" cy="2239200"/>
-                    </a:xfrm>
-                    <a:prstGeom prst="rect">
-                      <a:avLst/>
-                    </a:prstGeom>
-                  </pic:spPr>
-                </pic:pic>
-              </a:graphicData>
-            </a:graphic>
-          </wp:inline>
-        </w:drawing>
-      </w:r>
-    </w:p>
-    <w:p>
-      <w:pPr>
-        <w:jc w:val="center"/>
-      </w:pPr>
-      <w:r>
-        <w:rPr>
-          <w:noProof/>
-        </w:rPr>
-        <w:drawing>
-          <wp:inline distT="0" distB="0" distL="0" distR="0" wp14:anchorId="47D49CF1" wp14:editId="39CB8A52">
-            <wp:extent cx="2880000" cy="2239200"/>
-            <wp:effectExtent l="0" t="0" r="0" b="8890"/>
-            <wp:docPr id="2006493773" name="Picture 1" descr="A screenshot of a computer&#10;&#10;AI-generated content may be incorrect."/>
-            <wp:cNvGraphicFramePr>
-              <a:graphicFrameLocks xmlns:a="http://schemas.openxmlformats.org/drawingml/2006/main" noChangeAspect="1"/>
-            </wp:cNvGraphicFramePr>
-            <a:graphic xmlns:a="http://schemas.openxmlformats.org/drawingml/2006/main">
-              <a:graphicData uri="http://schemas.openxmlformats.org/drawingml/2006/picture">
-                <pic:pic xmlns:pic="http://schemas.openxmlformats.org/drawingml/2006/picture">
-                  <pic:nvPicPr>
-                    <pic:cNvPr id="2006493773" name="Picture 1" descr="A screenshot of a computer&#10;&#10;AI-generated content may be incorrect."/>
                     <pic:cNvPicPr/>
                   </pic:nvPicPr>
                   <pic:blipFill>
@@ -20262,10 +21309,10 @@
           <w:noProof/>
         </w:rPr>
         <w:drawing>
-          <wp:inline distT="0" distB="0" distL="0" distR="0" wp14:anchorId="53F97658" wp14:editId="5086501E">
+          <wp:inline distT="0" distB="0" distL="0" distR="0" wp14:anchorId="62CAF537" wp14:editId="58867CEC">
             <wp:extent cx="2880000" cy="2239200"/>
             <wp:effectExtent l="0" t="0" r="0" b="8890"/>
-            <wp:docPr id="1312949845" name="Picture 1" descr="A screenshot of a computer&#10;&#10;AI-generated content may be incorrect."/>
+            <wp:docPr id="117568169" name="Picture 1"/>
             <wp:cNvGraphicFramePr>
               <a:graphicFrameLocks xmlns:a="http://schemas.openxmlformats.org/drawingml/2006/main" noChangeAspect="1"/>
             </wp:cNvGraphicFramePr>
@@ -20273,7 +21320,7 @@
               <a:graphicData uri="http://schemas.openxmlformats.org/drawingml/2006/picture">
                 <pic:pic xmlns:pic="http://schemas.openxmlformats.org/drawingml/2006/picture">
                   <pic:nvPicPr>
-                    <pic:cNvPr id="1312949845" name="Picture 1" descr="A screenshot of a computer&#10;&#10;AI-generated content may be incorrect."/>
+                    <pic:cNvPr id="117568169" name=""/>
                     <pic:cNvPicPr/>
                   </pic:nvPicPr>
                   <pic:blipFill>
@@ -20301,19 +21348,16 @@
     <w:p>
       <w:pPr>
         <w:jc w:val="center"/>
+      </w:pPr>
+      <w:r>
         <w:rPr>
           <w:noProof/>
         </w:rPr>
-      </w:pPr>
-      <w:r>
-        <w:rPr>
-          <w:noProof/>
-        </w:rPr>
         <w:drawing>
-          <wp:inline distT="0" distB="0" distL="0" distR="0" wp14:anchorId="53652435" wp14:editId="4BBC710E">
+          <wp:inline distT="0" distB="0" distL="0" distR="0" wp14:anchorId="47D49CF1" wp14:editId="39CB8A52">
             <wp:extent cx="2880000" cy="2239200"/>
             <wp:effectExtent l="0" t="0" r="0" b="8890"/>
-            <wp:docPr id="1484358751" name="Picture 1" descr="A screenshot of a computer&#10;&#10;AI-generated content may be incorrect."/>
+            <wp:docPr id="2006493773" name="Picture 1" descr="A screenshot of a computer&#10;&#10;AI-generated content may be incorrect."/>
             <wp:cNvGraphicFramePr>
               <a:graphicFrameLocks xmlns:a="http://schemas.openxmlformats.org/drawingml/2006/main" noChangeAspect="1"/>
             </wp:cNvGraphicFramePr>
@@ -20321,7 +21365,7 @@
               <a:graphicData uri="http://schemas.openxmlformats.org/drawingml/2006/picture">
                 <pic:pic xmlns:pic="http://schemas.openxmlformats.org/drawingml/2006/picture">
                   <pic:nvPicPr>
-                    <pic:cNvPr id="1484358751" name="Picture 1" descr="A screenshot of a computer&#10;&#10;AI-generated content may be incorrect."/>
+                    <pic:cNvPr id="2006493773" name="Picture 1" descr="A screenshot of a computer&#10;&#10;AI-generated content may be incorrect."/>
                     <pic:cNvPicPr/>
                   </pic:nvPicPr>
                   <pic:blipFill>
@@ -20346,20 +21390,17 @@
         </w:drawing>
       </w:r>
       <w:r>
+        <w:t xml:space="preserve">     </w:t>
+      </w:r>
+      <w:r>
         <w:rPr>
           <w:noProof/>
         </w:rPr>
-        <w:t xml:space="preserve">     </w:t>
-      </w:r>
-      <w:r>
-        <w:rPr>
-          <w:noProof/>
-        </w:rPr>
         <w:drawing>
-          <wp:inline distT="0" distB="0" distL="0" distR="0" wp14:anchorId="5EF6FE99" wp14:editId="1749FDFB">
+          <wp:inline distT="0" distB="0" distL="0" distR="0" wp14:anchorId="53F97658" wp14:editId="5086501E">
             <wp:extent cx="2880000" cy="2239200"/>
             <wp:effectExtent l="0" t="0" r="0" b="8890"/>
-            <wp:docPr id="1091793262" name="Picture 1"/>
+            <wp:docPr id="1312949845" name="Picture 1" descr="A screenshot of a computer&#10;&#10;AI-generated content may be incorrect."/>
             <wp:cNvGraphicFramePr>
               <a:graphicFrameLocks xmlns:a="http://schemas.openxmlformats.org/drawingml/2006/main" noChangeAspect="1"/>
             </wp:cNvGraphicFramePr>
@@ -20367,7 +21408,7 @@
               <a:graphicData uri="http://schemas.openxmlformats.org/drawingml/2006/picture">
                 <pic:pic xmlns:pic="http://schemas.openxmlformats.org/drawingml/2006/picture">
                   <pic:nvPicPr>
-                    <pic:cNvPr id="1091793262" name=""/>
+                    <pic:cNvPr id="1312949845" name="Picture 1" descr="A screenshot of a computer&#10;&#10;AI-generated content may be incorrect."/>
                     <pic:cNvPicPr/>
                   </pic:nvPicPr>
                   <pic:blipFill>
@@ -20395,17 +21436,19 @@
     <w:p>
       <w:pPr>
         <w:jc w:val="center"/>
-      </w:pPr>
-      <w:r>
         <w:rPr>
           <w:noProof/>
         </w:rPr>
-        <w:lastRenderedPageBreak/>
+      </w:pPr>
+      <w:r>
+        <w:rPr>
+          <w:noProof/>
+        </w:rPr>
         <w:drawing>
-          <wp:inline distT="0" distB="0" distL="0" distR="0" wp14:anchorId="525FB91D" wp14:editId="37424F59">
+          <wp:inline distT="0" distB="0" distL="0" distR="0" wp14:anchorId="53652435" wp14:editId="4BBC710E">
             <wp:extent cx="2880000" cy="2239200"/>
             <wp:effectExtent l="0" t="0" r="0" b="8890"/>
-            <wp:docPr id="1610898227" name="Picture 1" descr="A screenshot of a computer program&#10;&#10;AI-generated content may be incorrect."/>
+            <wp:docPr id="1484358751" name="Picture 1" descr="A screenshot of a computer&#10;&#10;AI-generated content may be incorrect."/>
             <wp:cNvGraphicFramePr>
               <a:graphicFrameLocks xmlns:a="http://schemas.openxmlformats.org/drawingml/2006/main" noChangeAspect="1"/>
             </wp:cNvGraphicFramePr>
@@ -20413,7 +21456,7 @@
               <a:graphicData uri="http://schemas.openxmlformats.org/drawingml/2006/picture">
                 <pic:pic xmlns:pic="http://schemas.openxmlformats.org/drawingml/2006/picture">
                   <pic:nvPicPr>
-                    <pic:cNvPr id="1610898227" name="Picture 1" descr="A screenshot of a computer program&#10;&#10;AI-generated content may be incorrect."/>
+                    <pic:cNvPr id="1484358751" name="Picture 1" descr="A screenshot of a computer&#10;&#10;AI-generated content may be incorrect."/>
                     <pic:cNvPicPr/>
                   </pic:nvPicPr>
                   <pic:blipFill>
@@ -20438,6 +21481,9 @@
         </w:drawing>
       </w:r>
       <w:r>
+        <w:rPr>
+          <w:noProof/>
+        </w:rPr>
         <w:t xml:space="preserve">     </w:t>
       </w:r>
       <w:r>
@@ -20445,10 +21491,10 @@
           <w:noProof/>
         </w:rPr>
         <w:drawing>
-          <wp:inline distT="0" distB="0" distL="0" distR="0" wp14:anchorId="27EC89D7" wp14:editId="05EAC9ED">
+          <wp:inline distT="0" distB="0" distL="0" distR="0" wp14:anchorId="5EF6FE99" wp14:editId="1749FDFB">
             <wp:extent cx="2880000" cy="2239200"/>
             <wp:effectExtent l="0" t="0" r="0" b="8890"/>
-            <wp:docPr id="1312928098" name="Picture 1" descr="A screenshot of a computer screen&#10;&#10;AI-generated content may be incorrect."/>
+            <wp:docPr id="1091793262" name="Picture 1"/>
             <wp:cNvGraphicFramePr>
               <a:graphicFrameLocks xmlns:a="http://schemas.openxmlformats.org/drawingml/2006/main" noChangeAspect="1"/>
             </wp:cNvGraphicFramePr>
@@ -20456,7 +21502,7 @@
               <a:graphicData uri="http://schemas.openxmlformats.org/drawingml/2006/picture">
                 <pic:pic xmlns:pic="http://schemas.openxmlformats.org/drawingml/2006/picture">
                   <pic:nvPicPr>
-                    <pic:cNvPr id="1312928098" name="Picture 1" descr="A screenshot of a computer screen&#10;&#10;AI-generated content may be incorrect."/>
+                    <pic:cNvPr id="1091793262" name=""/>
                     <pic:cNvPicPr/>
                   </pic:nvPicPr>
                   <pic:blipFill>
@@ -20489,11 +21535,12 @@
         <w:rPr>
           <w:noProof/>
         </w:rPr>
+        <w:lastRenderedPageBreak/>
         <w:drawing>
-          <wp:inline distT="0" distB="0" distL="0" distR="0" wp14:anchorId="6B8A0C9D" wp14:editId="1B512C3E">
+          <wp:inline distT="0" distB="0" distL="0" distR="0" wp14:anchorId="525FB91D" wp14:editId="37424F59">
             <wp:extent cx="2880000" cy="2239200"/>
             <wp:effectExtent l="0" t="0" r="0" b="8890"/>
-            <wp:docPr id="429204919" name="Picture 1" descr="A screenshot of a computer&#10;&#10;AI-generated content may be incorrect."/>
+            <wp:docPr id="1610898227" name="Picture 1" descr="A screenshot of a computer program&#10;&#10;AI-generated content may be incorrect."/>
             <wp:cNvGraphicFramePr>
               <a:graphicFrameLocks xmlns:a="http://schemas.openxmlformats.org/drawingml/2006/main" noChangeAspect="1"/>
             </wp:cNvGraphicFramePr>
@@ -20501,7 +21548,7 @@
               <a:graphicData uri="http://schemas.openxmlformats.org/drawingml/2006/picture">
                 <pic:pic xmlns:pic="http://schemas.openxmlformats.org/drawingml/2006/picture">
                   <pic:nvPicPr>
-                    <pic:cNvPr id="429204919" name="Picture 1" descr="A screenshot of a computer&#10;&#10;AI-generated content may be incorrect."/>
+                    <pic:cNvPr id="1610898227" name="Picture 1" descr="A screenshot of a computer program&#10;&#10;AI-generated content may be incorrect."/>
                     <pic:cNvPicPr/>
                   </pic:nvPicPr>
                   <pic:blipFill>
@@ -20533,10 +21580,10 @@
           <w:noProof/>
         </w:rPr>
         <w:drawing>
-          <wp:inline distT="0" distB="0" distL="0" distR="0" wp14:anchorId="05D83297" wp14:editId="141B0145">
+          <wp:inline distT="0" distB="0" distL="0" distR="0" wp14:anchorId="27EC89D7" wp14:editId="05EAC9ED">
             <wp:extent cx="2880000" cy="2239200"/>
             <wp:effectExtent l="0" t="0" r="0" b="8890"/>
-            <wp:docPr id="184780679" name="Picture 1"/>
+            <wp:docPr id="1312928098" name="Picture 1" descr="A screenshot of a computer screen&#10;&#10;AI-generated content may be incorrect."/>
             <wp:cNvGraphicFramePr>
               <a:graphicFrameLocks xmlns:a="http://schemas.openxmlformats.org/drawingml/2006/main" noChangeAspect="1"/>
             </wp:cNvGraphicFramePr>
@@ -20544,7 +21591,7 @@
               <a:graphicData uri="http://schemas.openxmlformats.org/drawingml/2006/picture">
                 <pic:pic xmlns:pic="http://schemas.openxmlformats.org/drawingml/2006/picture">
                   <pic:nvPicPr>
-                    <pic:cNvPr id="184780679" name=""/>
+                    <pic:cNvPr id="1312928098" name="Picture 1" descr="A screenshot of a computer screen&#10;&#10;AI-generated content may be incorrect."/>
                     <pic:cNvPicPr/>
                   </pic:nvPicPr>
                   <pic:blipFill>
@@ -20578,10 +21625,10 @@
           <w:noProof/>
         </w:rPr>
         <w:drawing>
-          <wp:inline distT="0" distB="0" distL="0" distR="0" wp14:anchorId="5F193067" wp14:editId="6B0C7720">
+          <wp:inline distT="0" distB="0" distL="0" distR="0" wp14:anchorId="6B8A0C9D" wp14:editId="1B512C3E">
             <wp:extent cx="2880000" cy="2239200"/>
             <wp:effectExtent l="0" t="0" r="0" b="8890"/>
-            <wp:docPr id="1915314406" name="Picture 1" descr="A screenshot of a computer&#10;&#10;AI-generated content may be incorrect."/>
+            <wp:docPr id="429204919" name="Picture 1" descr="A screenshot of a computer&#10;&#10;AI-generated content may be incorrect."/>
             <wp:cNvGraphicFramePr>
               <a:graphicFrameLocks xmlns:a="http://schemas.openxmlformats.org/drawingml/2006/main" noChangeAspect="1"/>
             </wp:cNvGraphicFramePr>
@@ -20589,7 +21636,7 @@
               <a:graphicData uri="http://schemas.openxmlformats.org/drawingml/2006/picture">
                 <pic:pic xmlns:pic="http://schemas.openxmlformats.org/drawingml/2006/picture">
                   <pic:nvPicPr>
-                    <pic:cNvPr id="1915314406" name="Picture 1" descr="A screenshot of a computer&#10;&#10;AI-generated content may be incorrect."/>
+                    <pic:cNvPr id="429204919" name="Picture 1" descr="A screenshot of a computer&#10;&#10;AI-generated content may be incorrect."/>
                     <pic:cNvPicPr/>
                   </pic:nvPicPr>
                   <pic:blipFill>
@@ -20613,25 +21660,113 @@
           </wp:inline>
         </w:drawing>
       </w:r>
+      <w:r>
+        <w:t xml:space="preserve">     </w:t>
+      </w:r>
+      <w:r>
+        <w:rPr>
+          <w:noProof/>
+        </w:rPr>
+        <w:drawing>
+          <wp:inline distT="0" distB="0" distL="0" distR="0" wp14:anchorId="05D83297" wp14:editId="141B0145">
+            <wp:extent cx="2880000" cy="2239200"/>
+            <wp:effectExtent l="0" t="0" r="0" b="8890"/>
+            <wp:docPr id="184780679" name="Picture 1"/>
+            <wp:cNvGraphicFramePr>
+              <a:graphicFrameLocks xmlns:a="http://schemas.openxmlformats.org/drawingml/2006/main" noChangeAspect="1"/>
+            </wp:cNvGraphicFramePr>
+            <a:graphic xmlns:a="http://schemas.openxmlformats.org/drawingml/2006/main">
+              <a:graphicData uri="http://schemas.openxmlformats.org/drawingml/2006/picture">
+                <pic:pic xmlns:pic="http://schemas.openxmlformats.org/drawingml/2006/picture">
+                  <pic:nvPicPr>
+                    <pic:cNvPr id="184780679" name=""/>
+                    <pic:cNvPicPr/>
+                  </pic:nvPicPr>
+                  <pic:blipFill>
+                    <a:blip r:embed="rId46"/>
+                    <a:stretch>
+                      <a:fillRect/>
+                    </a:stretch>
+                  </pic:blipFill>
+                  <pic:spPr>
+                    <a:xfrm>
+                      <a:off x="0" y="0"/>
+                      <a:ext cx="2880000" cy="2239200"/>
+                    </a:xfrm>
+                    <a:prstGeom prst="rect">
+                      <a:avLst/>
+                    </a:prstGeom>
+                  </pic:spPr>
+                </pic:pic>
+              </a:graphicData>
+            </a:graphic>
+          </wp:inline>
+        </w:drawing>
+      </w:r>
+    </w:p>
+    <w:p>
+      <w:pPr>
+        <w:jc w:val="center"/>
+      </w:pPr>
+      <w:r>
+        <w:rPr>
+          <w:noProof/>
+        </w:rPr>
+        <w:drawing>
+          <wp:inline distT="0" distB="0" distL="0" distR="0" wp14:anchorId="5F193067" wp14:editId="6B0C7720">
+            <wp:extent cx="2880000" cy="2239200"/>
+            <wp:effectExtent l="0" t="0" r="0" b="8890"/>
+            <wp:docPr id="1915314406" name="Picture 1" descr="A screenshot of a computer&#10;&#10;AI-generated content may be incorrect."/>
+            <wp:cNvGraphicFramePr>
+              <a:graphicFrameLocks xmlns:a="http://schemas.openxmlformats.org/drawingml/2006/main" noChangeAspect="1"/>
+            </wp:cNvGraphicFramePr>
+            <a:graphic xmlns:a="http://schemas.openxmlformats.org/drawingml/2006/main">
+              <a:graphicData uri="http://schemas.openxmlformats.org/drawingml/2006/picture">
+                <pic:pic xmlns:pic="http://schemas.openxmlformats.org/drawingml/2006/picture">
+                  <pic:nvPicPr>
+                    <pic:cNvPr id="1915314406" name="Picture 1" descr="A screenshot of a computer&#10;&#10;AI-generated content may be incorrect."/>
+                    <pic:cNvPicPr/>
+                  </pic:nvPicPr>
+                  <pic:blipFill>
+                    <a:blip r:embed="rId47"/>
+                    <a:stretch>
+                      <a:fillRect/>
+                    </a:stretch>
+                  </pic:blipFill>
+                  <pic:spPr>
+                    <a:xfrm>
+                      <a:off x="0" y="0"/>
+                      <a:ext cx="2880000" cy="2239200"/>
+                    </a:xfrm>
+                    <a:prstGeom prst="rect">
+                      <a:avLst/>
+                    </a:prstGeom>
+                  </pic:spPr>
+                </pic:pic>
+              </a:graphicData>
+            </a:graphic>
+          </wp:inline>
+        </w:drawing>
+      </w:r>
     </w:p>
     <w:p/>
     <w:p>
       <w:pPr>
         <w:pStyle w:val="Heading2"/>
       </w:pPr>
-      <w:bookmarkStart w:id="31" w:name="_Toc238635427"/>
+      <w:bookmarkStart w:id="34" w:name="_Toc239753751"/>
       <w:r>
         <w:lastRenderedPageBreak/>
         <w:t>Checking the Wireshark Installation</w:t>
       </w:r>
-      <w:bookmarkEnd w:id="30"/>
+      <w:bookmarkEnd w:id="33"/>
       <w:r>
         <w:t xml:space="preserve"> on </w:t>
       </w:r>
       <w:r>
         <w:t>Windows</w:t>
       </w:r>
-      <w:bookmarkEnd w:id="31"/>
+      <w:bookmarkEnd w:id="34"/>
     </w:p>
     <w:p>
       <w:pPr>
@@ -20680,7 +21815,7 @@
                     <pic:cNvPicPr/>
                   </pic:nvPicPr>
                   <pic:blipFill>
-                    <a:blip r:embed="rId46"/>
+                    <a:blip r:embed="rId48"/>
                     <a:stretch>
                       <a:fillRect/>
                     </a:stretch>
@@ -20705,13 +21840,13 @@
       <w:pPr>
         <w:pStyle w:val="Heading2"/>
       </w:pPr>
-      <w:bookmarkStart w:id="32" w:name="_Toc131600802"/>
-      <w:bookmarkStart w:id="33" w:name="_Toc238635428"/>
+      <w:bookmarkStart w:id="35" w:name="_Toc131600802"/>
+      <w:bookmarkStart w:id="36" w:name="_Toc239753752"/>
       <w:r>
         <w:t>Setting up a Test &amp; Learning Environment</w:t>
       </w:r>
-      <w:bookmarkEnd w:id="32"/>
-      <w:bookmarkEnd w:id="33"/>
+      <w:bookmarkEnd w:id="35"/>
+      <w:bookmarkEnd w:id="36"/>
     </w:p>
     <w:p>
       <w:r>
@@ -20744,7 +21879,7 @@
       <w:r>
         <w:t xml:space="preserve"> </w:t>
       </w:r>
-      <w:hyperlink r:id="rId47" w:history="1">
+      <w:hyperlink r:id="rId49" w:history="1">
         <w:r>
           <w:rPr>
             <w:rStyle w:val="Hyperlink"/>
@@ -20764,7 +21899,7 @@
           <w:numId w:val="11"/>
         </w:numPr>
       </w:pPr>
-      <w:hyperlink r:id="rId48" w:history="1">
+      <w:hyperlink r:id="rId50" w:history="1">
         <w:r>
           <w:rPr>
             <w:rStyle w:val="Hyperlink"/>
@@ -20796,7 +21931,7 @@
       <w:r>
         <w:t xml:space="preserve">: </w:t>
       </w:r>
-      <w:hyperlink r:id="rId49" w:history="1">
+      <w:hyperlink r:id="rId51" w:history="1">
         <w:r>
           <w:rPr>
             <w:rStyle w:val="Hyperlink"/>
@@ -20866,7 +22001,7 @@
       <w:r>
         <w:t xml:space="preserve">here: </w:t>
       </w:r>
-      <w:hyperlink r:id="rId50" w:history="1">
+      <w:hyperlink r:id="rId52" w:history="1">
         <w:r>
           <w:rPr>
             <w:rStyle w:val="Hyperlink"/>
@@ -20910,7 +22045,7 @@
       <w:r>
         <w:t xml:space="preserve">here: </w:t>
       </w:r>
-      <w:hyperlink r:id="rId51" w:history="1">
+      <w:hyperlink r:id="rId53" w:history="1">
         <w:r>
           <w:rPr>
             <w:rStyle w:val="Hyperlink"/>
@@ -20979,7 +22114,7 @@
                     </pic:cNvPicPr>
                   </pic:nvPicPr>
                   <pic:blipFill>
-                    <a:blip r:embed="rId52" cstate="print"/>
+                    <a:blip r:embed="rId54" cstate="print"/>
                     <a:srcRect/>
                     <a:stretch>
                       <a:fillRect/>
@@ -21062,7 +22197,7 @@
       <w:r>
         <w:t xml:space="preserve">It's beyond the scope of this document to be a tutorial on Wireshark. There are loads of videos on YouTube covering Wireshark. And there's always the </w:t>
       </w:r>
-      <w:hyperlink r:id="rId53" w:history="1">
+      <w:hyperlink r:id="rId55" w:history="1">
         <w:r>
           <w:rPr>
             <w:rStyle w:val="Hyperlink"/>
@@ -21087,7 +22222,7 @@
       <w:r>
         <w:t xml:space="preserve">that can be downloaded from here: </w:t>
       </w:r>
-      <w:hyperlink r:id="rId54" w:history="1">
+      <w:hyperlink r:id="rId56" w:history="1">
         <w:r>
           <w:rPr>
             <w:rStyle w:val="Hyperlink"/>
@@ -21119,7 +22254,7 @@
           <w:highlight w:val="white"/>
         </w:rPr>
       </w:pPr>
-      <w:bookmarkStart w:id="34" w:name="_Toc238635429"/>
+      <w:bookmarkStart w:id="37" w:name="_Toc239753753"/>
       <w:r>
         <w:rPr>
           <w:highlight w:val="white"/>
@@ -21127,7 +22262,7 @@
         <w:lastRenderedPageBreak/>
         <w:t>Appendix 4 – Document Change History</w:t>
       </w:r>
-      <w:bookmarkEnd w:id="34"/>
+      <w:bookmarkEnd w:id="37"/>
     </w:p>
     <w:p>
       <w:pPr>
@@ -21136,14 +22271,14 @@
           <w:highlight w:val="white"/>
         </w:rPr>
       </w:pPr>
-      <w:bookmarkStart w:id="35" w:name="_Toc238635430"/>
+      <w:bookmarkStart w:id="38" w:name="_Toc239753754"/>
       <w:r>
         <w:rPr>
           <w:highlight w:val="white"/>
         </w:rPr>
         <w:t>Version 1</w:t>
       </w:r>
-      <w:bookmarkEnd w:id="35"/>
+      <w:bookmarkEnd w:id="38"/>
     </w:p>
     <w:p>
       <w:pPr>
@@ -21170,7 +22305,7 @@
           <w:highlight w:val="white"/>
         </w:rPr>
       </w:pPr>
-      <w:bookmarkStart w:id="36" w:name="_Toc238635431"/>
+      <w:bookmarkStart w:id="39" w:name="_Toc239753755"/>
       <w:r>
         <w:rPr>
           <w:highlight w:val="white"/>
@@ -21183,7 +22318,7 @@
         </w:rPr>
         <w:t xml:space="preserve"> – October 2025</w:t>
       </w:r>
-      <w:bookmarkEnd w:id="36"/>
+      <w:bookmarkEnd w:id="39"/>
     </w:p>
     <w:p>
       <w:pPr>
@@ -21246,14 +22381,14 @@
           <w:highlight w:val="white"/>
         </w:rPr>
       </w:pPr>
-      <w:bookmarkStart w:id="37" w:name="_Toc238635432"/>
+      <w:bookmarkStart w:id="40" w:name="_Toc239753756"/>
       <w:r>
         <w:rPr>
           <w:highlight w:val="white"/>
         </w:rPr>
         <w:t>Version 3 – January 2026</w:t>
       </w:r>
-      <w:bookmarkEnd w:id="37"/>
+      <w:bookmarkEnd w:id="40"/>
     </w:p>
     <w:p>
       <w:pPr>
@@ -21316,14 +22451,14 @@
           <w:highlight w:val="white"/>
         </w:rPr>
       </w:pPr>
-      <w:bookmarkStart w:id="38" w:name="_Toc238635433"/>
+      <w:bookmarkStart w:id="41" w:name="_Toc239753757"/>
       <w:r>
         <w:rPr>
           <w:highlight w:val="white"/>
         </w:rPr>
         <w:t>Version 4 – September 2026</w:t>
       </w:r>
-      <w:bookmarkEnd w:id="38"/>
+      <w:bookmarkEnd w:id="41"/>
     </w:p>
     <w:p>
       <w:pPr>
@@ -21403,9 +22538,45 @@
         <w:t>Updated for latest template release.</w:t>
       </w:r>
     </w:p>
+    <w:p>
+      <w:pPr>
+        <w:pStyle w:val="ListParagraph"/>
+        <w:numPr>
+          <w:ilvl w:val="0"/>
+          <w:numId w:val="14"/>
+        </w:numPr>
+        <w:rPr>
+          <w:highlight w:val="white"/>
+        </w:rPr>
+      </w:pPr>
+      <w:r>
+        <w:rPr>
+          <w:highlight w:val="white"/>
+        </w:rPr>
+        <w:t>Added configuration options section.</w:t>
+      </w:r>
+    </w:p>
+    <w:p>
+      <w:pPr>
+        <w:pStyle w:val="ListParagraph"/>
+        <w:numPr>
+          <w:ilvl w:val="0"/>
+          <w:numId w:val="14"/>
+        </w:numPr>
+        <w:rPr>
+          <w:highlight w:val="white"/>
+        </w:rPr>
+      </w:pPr>
+      <w:r>
+        <w:rPr>
+          <w:highlight w:val="white"/>
+        </w:rPr>
+        <w:t>Added links to the Alpaca API specification and the canonical interface definitions.</w:t>
+      </w:r>
+    </w:p>
     <w:sectPr>
-      <w:headerReference w:type="default" r:id="rId55"/>
-      <w:footerReference w:type="default" r:id="rId56"/>
+      <w:headerReference w:type="default" r:id="rId57"/>
+      <w:footerReference w:type="default" r:id="rId58"/>
       <w:pgSz w:w="11906" w:h="16838"/>
       <w:pgMar w:top="1440" w:right="1134" w:bottom="851" w:left="1134" w:header="709" w:footer="409" w:gutter="0"/>
       <w:pgNumType w:start="0"/>
@@ -21508,7 +22679,7 @@
         <w:sz w:val="16"/>
         <w:szCs w:val="16"/>
       </w:rPr>
-      <w:t>26/08/2026 11:54</w:t>
+      <w:t>08/09/2026 09:52</w:t>
     </w:r>
     <w:r>
       <w:rPr>
@@ -22563,9 +23734,9 @@
     </w:lvl>
   </w:abstractNum>
   <w:abstractNum w:abstractNumId="8" w15:restartNumberingAfterBreak="0">
-    <w:nsid w:val="34991E7A"/>
+    <w:nsid w:val="335F01A6"/>
     <w:multiLevelType w:val="hybridMultilevel"/>
-    <w:tmpl w:val="E5DA6BE6"/>
+    <w:tmpl w:val="DD1AF268"/>
     <w:lvl w:ilvl="0" w:tplc="08090001">
       <w:start w:val="1"/>
       <w:numFmt w:val="bullet"/>
@@ -22676,6 +23847,119 @@
     </w:lvl>
   </w:abstractNum>
   <w:abstractNum w:abstractNumId="9" w15:restartNumberingAfterBreak="0">
+    <w:nsid w:val="34991E7A"/>
+    <w:multiLevelType w:val="hybridMultilevel"/>
+    <w:tmpl w:val="E5DA6BE6"/>
+    <w:lvl w:ilvl="0" w:tplc="08090001">
+      <w:start w:val="1"/>
+      <w:numFmt w:val="bullet"/>
+      <w:lvlText w:val=""/>
+      <w:lvlJc w:val="left"/>
+      <w:pPr>
+        <w:ind w:left="720" w:hanging="360"/>
+      </w:pPr>
+      <w:rPr>
+        <w:rFonts w:ascii="Symbol" w:hAnsi="Symbol" w:hint="default"/>
+      </w:rPr>
+    </w:lvl>
+    <w:lvl w:ilvl="1" w:tplc="08090003" w:tentative="1">
+      <w:start w:val="1"/>
+      <w:numFmt w:val="bullet"/>
+      <w:lvlText w:val="o"/>
+      <w:lvlJc w:val="left"/>
+      <w:pPr>
+        <w:ind w:left="1440" w:hanging="360"/>
+      </w:pPr>
+      <w:rPr>
+        <w:rFonts w:ascii="Courier New" w:hAnsi="Courier New" w:cs="Courier New" w:hint="default"/>
+      </w:rPr>
+    </w:lvl>
+    <w:lvl w:ilvl="2" w:tplc="08090005" w:tentative="1">
+      <w:start w:val="1"/>
+      <w:numFmt w:val="bullet"/>
+      <w:lvlText w:val=""/>
+      <w:lvlJc w:val="left"/>
+      <w:pPr>
+        <w:ind w:left="2160" w:hanging="360"/>
+      </w:pPr>
+      <w:rPr>
+        <w:rFonts w:ascii="Wingdings" w:hAnsi="Wingdings" w:hint="default"/>
+      </w:rPr>
+    </w:lvl>
+    <w:lvl w:ilvl="3" w:tplc="08090001" w:tentative="1">
+      <w:start w:val="1"/>
+      <w:numFmt w:val="bullet"/>
+      <w:lvlText w:val=""/>
+      <w:lvlJc w:val="left"/>
+      <w:pPr>
+        <w:ind w:left="2880" w:hanging="360"/>
+      </w:pPr>
+      <w:rPr>
+        <w:rFonts w:ascii="Symbol" w:hAnsi="Symbol" w:hint="default"/>
+      </w:rPr>
+    </w:lvl>
+    <w:lvl w:ilvl="4" w:tplc="08090003" w:tentative="1">
+      <w:start w:val="1"/>
+      <w:numFmt w:val="bullet"/>
+      <w:lvlText w:val="o"/>
+      <w:lvlJc w:val="left"/>
+      <w:pPr>
+        <w:ind w:left="3600" w:hanging="360"/>
+      </w:pPr>
+      <w:rPr>
+        <w:rFonts w:ascii="Courier New" w:hAnsi="Courier New" w:cs="Courier New" w:hint="default"/>
+      </w:rPr>
+    </w:lvl>
+    <w:lvl w:ilvl="5" w:tplc="08090005" w:tentative="1">
+      <w:start w:val="1"/>
+      <w:numFmt w:val="bullet"/>
+      <w:lvlText w:val=""/>
+      <w:lvlJc w:val="left"/>
+      <w:pPr>
+        <w:ind w:left="4320" w:hanging="360"/>
+      </w:pPr>
+      <w:rPr>
+        <w:rFonts w:ascii="Wingdings" w:hAnsi="Wingdings" w:hint="default"/>
+      </w:rPr>
+    </w:lvl>
+    <w:lvl w:ilvl="6" w:tplc="08090001" w:tentative="1">
+      <w:start w:val="1"/>
+      <w:numFmt w:val="bullet"/>
+      <w:lvlText w:val=""/>
+      <w:lvlJc w:val="left"/>
+      <w:pPr>
+        <w:ind w:left="5040" w:hanging="360"/>
+      </w:pPr>
+      <w:rPr>
+        <w:rFonts w:ascii="Symbol" w:hAnsi="Symbol" w:hint="default"/>
+      </w:rPr>
+    </w:lvl>
+    <w:lvl w:ilvl="7" w:tplc="08090003" w:tentative="1">
+      <w:start w:val="1"/>
+      <w:numFmt w:val="bullet"/>
+      <w:lvlText w:val="o"/>
+      <w:lvlJc w:val="left"/>
+      <w:pPr>
+        <w:ind w:left="5760" w:hanging="360"/>
+      </w:pPr>
+      <w:rPr>
+        <w:rFonts w:ascii="Courier New" w:hAnsi="Courier New" w:cs="Courier New" w:hint="default"/>
+      </w:rPr>
+    </w:lvl>
+    <w:lvl w:ilvl="8" w:tplc="08090005" w:tentative="1">
+      <w:start w:val="1"/>
+      <w:numFmt w:val="bullet"/>
+      <w:lvlText w:val=""/>
+      <w:lvlJc w:val="left"/>
+      <w:pPr>
+        <w:ind w:left="6480" w:hanging="360"/>
+      </w:pPr>
+      <w:rPr>
+        <w:rFonts w:ascii="Wingdings" w:hAnsi="Wingdings" w:hint="default"/>
+      </w:rPr>
+    </w:lvl>
+  </w:abstractNum>
+  <w:abstractNum w:abstractNumId="10" w15:restartNumberingAfterBreak="0">
     <w:nsid w:val="3A191F43"/>
     <w:multiLevelType w:val="hybridMultilevel"/>
     <w:tmpl w:val="E4AEAC30"/>
@@ -22788,7 +24072,7 @@
       </w:rPr>
     </w:lvl>
   </w:abstractNum>
-  <w:abstractNum w:abstractNumId="10" w15:restartNumberingAfterBreak="0">
+  <w:abstractNum w:abstractNumId="11" w15:restartNumberingAfterBreak="0">
     <w:nsid w:val="3C3D2F04"/>
     <w:multiLevelType w:val="hybridMultilevel"/>
     <w:tmpl w:val="DA28DF64"/>
@@ -22901,7 +24185,7 @@
       </w:rPr>
     </w:lvl>
   </w:abstractNum>
-  <w:abstractNum w:abstractNumId="11" w15:restartNumberingAfterBreak="0">
+  <w:abstractNum w:abstractNumId="12" w15:restartNumberingAfterBreak="0">
     <w:nsid w:val="42743057"/>
     <w:multiLevelType w:val="hybridMultilevel"/>
     <w:tmpl w:val="54EEAD10"/>
@@ -23014,7 +24298,7 @@
       </w:rPr>
     </w:lvl>
   </w:abstractNum>
-  <w:abstractNum w:abstractNumId="12" w15:restartNumberingAfterBreak="0">
+  <w:abstractNum w:abstractNumId="13" w15:restartNumberingAfterBreak="0">
     <w:nsid w:val="46963808"/>
     <w:multiLevelType w:val="hybridMultilevel"/>
     <w:tmpl w:val="5B2AE6BC"/>
@@ -23127,7 +24411,7 @@
       </w:rPr>
     </w:lvl>
   </w:abstractNum>
-  <w:abstractNum w:abstractNumId="13" w15:restartNumberingAfterBreak="0">
+  <w:abstractNum w:abstractNumId="14" w15:restartNumberingAfterBreak="0">
     <w:nsid w:val="509E76F1"/>
     <w:multiLevelType w:val="hybridMultilevel"/>
     <w:tmpl w:val="83420236"/>
@@ -23240,7 +24524,7 @@
       </w:rPr>
     </w:lvl>
   </w:abstractNum>
-  <w:abstractNum w:abstractNumId="14" w15:restartNumberingAfterBreak="0">
+  <w:abstractNum w:abstractNumId="15" w15:restartNumberingAfterBreak="0">
     <w:nsid w:val="5483790D"/>
     <w:multiLevelType w:val="hybridMultilevel"/>
     <w:tmpl w:val="6F22EF42"/>
@@ -23353,7 +24637,7 @@
       </w:rPr>
     </w:lvl>
   </w:abstractNum>
-  <w:abstractNum w:abstractNumId="15" w15:restartNumberingAfterBreak="0">
+  <w:abstractNum w:abstractNumId="16" w15:restartNumberingAfterBreak="0">
     <w:nsid w:val="744B2309"/>
     <w:multiLevelType w:val="hybridMultilevel"/>
     <w:tmpl w:val="365CD04C"/>
@@ -23473,19 +24757,19 @@
     <w:abstractNumId w:val="0"/>
   </w:num>
   <w:num w:numId="3" w16cid:durableId="2125613068">
-    <w:abstractNumId w:val="10"/>
+    <w:abstractNumId w:val="11"/>
   </w:num>
   <w:num w:numId="4" w16cid:durableId="127628300">
     <w:abstractNumId w:val="7"/>
   </w:num>
   <w:num w:numId="5" w16cid:durableId="486022567">
-    <w:abstractNumId w:val="12"/>
+    <w:abstractNumId w:val="13"/>
   </w:num>
   <w:num w:numId="6" w16cid:durableId="1206988686">
     <w:abstractNumId w:val="1"/>
   </w:num>
   <w:num w:numId="7" w16cid:durableId="356585183">
-    <w:abstractNumId w:val="9"/>
+    <w:abstractNumId w:val="10"/>
   </w:num>
   <w:num w:numId="8" w16cid:durableId="1236747985">
     <w:abstractNumId w:val="2"/>
@@ -23497,22 +24781,25 @@
     <w:abstractNumId w:val="4"/>
   </w:num>
   <w:num w:numId="11" w16cid:durableId="1480801678">
-    <w:abstractNumId w:val="8"/>
+    <w:abstractNumId w:val="9"/>
   </w:num>
   <w:num w:numId="12" w16cid:durableId="1006522652">
-    <w:abstractNumId w:val="14"/>
+    <w:abstractNumId w:val="15"/>
   </w:num>
   <w:num w:numId="13" w16cid:durableId="1181890691">
-    <w:abstractNumId w:val="11"/>
+    <w:abstractNumId w:val="12"/>
   </w:num>
   <w:num w:numId="14" w16cid:durableId="201288894">
-    <w:abstractNumId w:val="15"/>
+    <w:abstractNumId w:val="16"/>
   </w:num>
   <w:num w:numId="15" w16cid:durableId="597518257">
-    <w:abstractNumId w:val="13"/>
+    <w:abstractNumId w:val="14"/>
   </w:num>
   <w:num w:numId="16" w16cid:durableId="138302102">
     <w:abstractNumId w:val="3"/>
+  </w:num>
+  <w:num w:numId="17" w16cid:durableId="2129156893">
+    <w:abstractNumId w:val="8"/>
   </w:num>
 </w:numbering>
 </file>

</xml_diff>